<commit_message>
dodanie .pdf z lab-b
</commit_message>
<xml_diff>
--- a/lab-b/materialy/AI1-LB-gr330B-Kulik-Jakub.docx
+++ b/lab-b/materialy/AI1-LB-gr330B-Kulik-Jakub.docx
@@ -18,8 +18,8 @@
         <w:tblLook w:firstRow="1" w:noVBand="1" w:lastRow="0" w:firstColumn="1" w:lastColumn="0" w:noHBand="0" w:val="04a0"/>
       </w:tblPr>
       <w:tblGrid>
-        <w:gridCol w:w="1695"/>
-        <w:gridCol w:w="4254"/>
+        <w:gridCol w:w="1694"/>
+        <w:gridCol w:w="4255"/>
         <w:gridCol w:w="4507"/>
       </w:tblGrid>
       <w:tr>
@@ -28,7 +28,7 @@
         </w:trPr>
         <w:tc>
           <w:tcPr>
-            <w:tcW w:w="1695" w:type="dxa"/>
+            <w:tcW w:w="1694" w:type="dxa"/>
             <w:vMerge w:val="restart"/>
             <w:tcBorders>
               <w:top w:val="single" w:sz="4" w:space="0" w:color="D9D9D9"/>
@@ -43,6 +43,7 @@
             <w:pPr>
               <w:pStyle w:val="Normal"/>
               <w:widowControl/>
+              <w:suppressAutoHyphens w:val="true"/>
               <w:spacing w:lineRule="auto" w:line="240" w:before="0" w:after="0"/>
               <w:jc w:val="center"/>
               <w:rPr>
@@ -115,7 +116,7 @@
         </w:tc>
         <w:tc>
           <w:tcPr>
-            <w:tcW w:w="4254" w:type="dxa"/>
+            <w:tcW w:w="4255" w:type="dxa"/>
             <w:vMerge w:val="restart"/>
             <w:tcBorders>
               <w:top w:val="single" w:sz="4" w:space="0" w:color="D9D9D9"/>
@@ -129,6 +130,7 @@
             <w:pPr>
               <w:pStyle w:val="Normal"/>
               <w:widowControl/>
+              <w:suppressAutoHyphens w:val="true"/>
               <w:spacing w:lineRule="auto" w:line="240" w:before="0" w:after="0"/>
               <w:jc w:val="center"/>
               <w:rPr>
@@ -252,6 +254,7 @@
             <w:pPr>
               <w:pStyle w:val="Normal"/>
               <w:widowControl/>
+              <w:suppressAutoHyphens w:val="true"/>
               <w:spacing w:lineRule="auto" w:line="240" w:before="0" w:after="0"/>
               <w:jc w:val="center"/>
               <w:rPr>
@@ -323,6 +326,7 @@
             <w:pPr>
               <w:pStyle w:val="Normal"/>
               <w:widowControl/>
+              <w:suppressAutoHyphens w:val="true"/>
               <w:spacing w:lineRule="auto" w:line="240" w:before="0" w:after="0"/>
               <w:jc w:val="center"/>
               <w:rPr>
@@ -406,6 +410,7 @@
             <w:pPr>
               <w:pStyle w:val="Normal"/>
               <w:widowControl/>
+              <w:suppressAutoHyphens w:val="true"/>
               <w:spacing w:lineRule="auto" w:line="240" w:before="0" w:after="0"/>
               <w:jc w:val="end"/>
               <w:rPr>
@@ -495,7 +500,7 @@
         </w:trPr>
         <w:tc>
           <w:tcPr>
-            <w:tcW w:w="1695" w:type="dxa"/>
+            <w:tcW w:w="1694" w:type="dxa"/>
             <w:vMerge w:val="continue"/>
             <w:tcBorders>
               <w:top w:val="single" w:sz="4" w:space="0" w:color="D9D9D9"/>
@@ -510,6 +515,7 @@
             <w:pPr>
               <w:pStyle w:val="Normal"/>
               <w:widowControl/>
+              <w:suppressAutoHyphens w:val="true"/>
               <w:spacing w:lineRule="auto" w:line="240" w:before="0" w:after="0"/>
               <w:jc w:val="center"/>
               <w:rPr>
@@ -522,20 +528,18 @@
             </w:pPr>
             <w:r>
               <w:rPr>
-                <w:rFonts w:eastAsia="Calibri" w:cs="Arial"/>
                 <w:b/>
                 <w:bCs/>
-                <w:kern w:val="2"/>
                 <w:sz w:val="48"/>
                 <w:szCs w:val="48"/>
-                <w:lang w:val="pl-PL" w:eastAsia="en-US" w:bidi="ar-SA"/>
+                <w:lang w:val="pl-PL"/>
               </w:rPr>
             </w:r>
           </w:p>
         </w:tc>
         <w:tc>
           <w:tcPr>
-            <w:tcW w:w="4254" w:type="dxa"/>
+            <w:tcW w:w="4255" w:type="dxa"/>
             <w:vMerge w:val="continue"/>
             <w:tcBorders>
               <w:top w:val="single" w:sz="4" w:space="0" w:color="D9D9D9"/>
@@ -549,6 +553,7 @@
             <w:pPr>
               <w:pStyle w:val="Normal"/>
               <w:widowControl/>
+              <w:suppressAutoHyphens w:val="true"/>
               <w:spacing w:lineRule="auto" w:line="240" w:before="0" w:after="0"/>
               <w:jc w:val="center"/>
               <w:rPr>
@@ -559,11 +564,9 @@
             </w:pPr>
             <w:r>
               <w:rPr>
-                <w:rFonts w:eastAsia="Calibri" w:cs="Arial"/>
-                <w:kern w:val="2"/>
                 <w:sz w:val="28"/>
                 <w:szCs w:val="28"/>
-                <w:lang w:val="pl-PL" w:eastAsia="en-US" w:bidi="ar-SA"/>
+                <w:lang w:val="pl-PL"/>
               </w:rPr>
             </w:r>
           </w:p>
@@ -583,6 +586,7 @@
             <w:pPr>
               <w:pStyle w:val="Normal"/>
               <w:widowControl/>
+              <w:suppressAutoHyphens w:val="true"/>
               <w:spacing w:lineRule="auto" w:line="240" w:before="0" w:after="0"/>
               <w:jc w:val="start"/>
               <w:rPr>
@@ -591,11 +595,7 @@
             </w:pPr>
             <w:r>
               <w:rPr>
-                <w:rFonts w:eastAsia="Calibri" w:cs="Arial"/>
-                <w:kern w:val="2"/>
-                <w:sz w:val="22"/>
-                <w:szCs w:val="22"/>
-                <w:lang w:val="pl-PL" w:eastAsia="en-US" w:bidi="ar-SA"/>
+                <w:lang w:val="pl-PL"/>
               </w:rPr>
             </w:r>
           </w:p>
@@ -607,7 +607,7 @@
         </w:trPr>
         <w:tc>
           <w:tcPr>
-            <w:tcW w:w="1695" w:type="dxa"/>
+            <w:tcW w:w="1694" w:type="dxa"/>
             <w:tcBorders>
               <w:top w:val="single" w:sz="4" w:space="0" w:color="D9D9D9"/>
               <w:start w:val="single" w:sz="4" w:space="0" w:color="D9D9D9"/>
@@ -620,6 +620,7 @@
             <w:pPr>
               <w:pStyle w:val="Normal"/>
               <w:widowControl/>
+              <w:suppressAutoHyphens w:val="true"/>
               <w:spacing w:lineRule="auto" w:line="240" w:before="0" w:after="0"/>
               <w:jc w:val="center"/>
               <w:rPr>
@@ -692,7 +693,7 @@
         </w:tc>
         <w:tc>
           <w:tcPr>
-            <w:tcW w:w="4254" w:type="dxa"/>
+            <w:tcW w:w="4255" w:type="dxa"/>
             <w:vMerge w:val="continue"/>
             <w:tcBorders>
               <w:top w:val="single" w:sz="4" w:space="0" w:color="D9D9D9"/>
@@ -705,6 +706,7 @@
             <w:pPr>
               <w:pStyle w:val="Normal"/>
               <w:widowControl/>
+              <w:suppressAutoHyphens w:val="true"/>
               <w:spacing w:lineRule="auto" w:line="240" w:before="0" w:after="0"/>
               <w:jc w:val="start"/>
               <w:rPr>
@@ -713,11 +715,7 @@
             </w:pPr>
             <w:r>
               <w:rPr>
-                <w:rFonts w:eastAsia="Calibri" w:cs="Arial"/>
-                <w:kern w:val="2"/>
-                <w:sz w:val="22"/>
-                <w:szCs w:val="22"/>
-                <w:lang w:val="pl-PL" w:eastAsia="en-US" w:bidi="ar-SA"/>
+                <w:lang w:val="pl-PL"/>
               </w:rPr>
             </w:r>
           </w:p>
@@ -737,6 +735,7 @@
             <w:pPr>
               <w:pStyle w:val="Normal"/>
               <w:widowControl/>
+              <w:suppressAutoHyphens w:val="true"/>
               <w:spacing w:lineRule="auto" w:line="240" w:before="0" w:after="0"/>
               <w:jc w:val="start"/>
               <w:rPr>
@@ -745,11 +744,7 @@
             </w:pPr>
             <w:r>
               <w:rPr>
-                <w:rFonts w:eastAsia="Calibri" w:cs="Arial"/>
-                <w:kern w:val="2"/>
-                <w:sz w:val="22"/>
-                <w:szCs w:val="22"/>
-                <w:lang w:val="pl-PL" w:eastAsia="en-US" w:bidi="ar-SA"/>
+                <w:lang w:val="pl-PL"/>
               </w:rPr>
             </w:r>
           </w:p>
@@ -815,6 +810,7 @@
             <w:rPr>
               <w:webHidden/>
               <w:rStyle w:val="czeindeksu"/>
+              <w:vanish w:val="false"/>
               <w:lang w:val="pl-PL"/>
             </w:rPr>
             <w:instrText xml:space="preserve"> TOC \z \o "1-3" \u \h</w:instrText>
@@ -823,6 +819,7 @@
             <w:rPr>
               <w:webHidden/>
               <w:rStyle w:val="czeindeksu"/>
+              <w:vanish w:val="false"/>
               <w:lang w:val="pl-PL"/>
             </w:rPr>
             <w:fldChar w:fldCharType="separate"/>
@@ -832,6 +829,7 @@
               <w:rPr>
                 <w:webHidden/>
                 <w:rStyle w:val="czeindeksu"/>
+                <w:vanish w:val="false"/>
                 <w:lang w:val="pl-PL"/>
               </w:rPr>
               <w:t>Spis treści</w:t>
@@ -889,6 +887,7 @@
               <w:rPr>
                 <w:webHidden/>
                 <w:rStyle w:val="czeindeksu"/>
+                <w:vanish w:val="false"/>
                 <w:lang w:val="pl-PL"/>
               </w:rPr>
               <w:t>Cel zajęć</w:t>
@@ -946,6 +945,7 @@
               <w:rPr>
                 <w:webHidden/>
                 <w:rStyle w:val="czeindeksu"/>
+                <w:vanish w:val="false"/>
                 <w:lang w:val="pl-PL"/>
               </w:rPr>
               <w:t>Rozpoczęcie</w:t>
@@ -1003,6 +1003,7 @@
               <w:rPr>
                 <w:webHidden/>
                 <w:rStyle w:val="czeindeksu"/>
+                <w:vanish w:val="false"/>
                 <w:lang w:val="pl-PL"/>
               </w:rPr>
               <w:t>Uwaga</w:t>
@@ -1060,6 +1061,7 @@
               <w:rPr>
                 <w:webHidden/>
                 <w:rStyle w:val="czeindeksu"/>
+                <w:vanish w:val="false"/>
                 <w:lang w:val="pl-PL"/>
               </w:rPr>
               <w:t>Wymagania</w:t>
@@ -1117,6 +1119,7 @@
               <w:rPr>
                 <w:webHidden/>
                 <w:rStyle w:val="czeindeksu"/>
+                <w:vanish w:val="false"/>
                 <w:lang w:val="pl-PL"/>
               </w:rPr>
               <w:t>Strona HTML</w:t>
@@ -1174,6 +1177,7 @@
               <w:rPr>
                 <w:webHidden/>
                 <w:rStyle w:val="czeindeksu"/>
+                <w:vanish w:val="false"/>
                 <w:lang w:val="pl-PL"/>
               </w:rPr>
               <w:t>Klasa Todo</w:t>
@@ -1231,6 +1235,7 @@
               <w:rPr>
                 <w:webHidden/>
                 <w:rStyle w:val="czeindeksu"/>
+                <w:vanish w:val="false"/>
                 <w:lang w:val="pl-PL"/>
               </w:rPr>
               <w:t>Dodawanie pozycji listy</w:t>
@@ -1288,6 +1293,7 @@
               <w:rPr>
                 <w:webHidden/>
                 <w:rStyle w:val="czeindeksu"/>
+                <w:vanish w:val="false"/>
                 <w:lang w:val="pl-PL"/>
               </w:rPr>
               <w:t>Usuwanie pozycji listy</w:t>
@@ -1345,6 +1351,7 @@
               <w:rPr>
                 <w:webHidden/>
                 <w:rStyle w:val="czeindeksu"/>
+                <w:vanish w:val="false"/>
                 <w:lang w:val="pl-PL"/>
               </w:rPr>
               <w:t>Edycja pozycji listy</w:t>
@@ -1402,6 +1409,7 @@
               <w:rPr>
                 <w:webHidden/>
                 <w:rStyle w:val="czeindeksu"/>
+                <w:vanish w:val="false"/>
                 <w:lang w:val="pl-PL"/>
               </w:rPr>
               <w:t>Odczyt / Zapis LocalStorage</w:t>
@@ -1459,6 +1467,7 @@
               <w:rPr>
                 <w:webHidden/>
                 <w:rStyle w:val="czeindeksu"/>
+                <w:vanish w:val="false"/>
                 <w:lang w:val="pl-PL"/>
               </w:rPr>
               <w:t>Wyszukiwanie</w:t>
@@ -1515,33 +1524,28 @@
             <w:r>
               <w:rPr>
                 <w:webHidden/>
-                <w:rStyle w:val="czeindeksu"/>
-              </w:rPr>
-              <w:t>Commit projektu do GIT</w:t>
+              </w:rPr>
+              <w:fldChar w:fldCharType="begin"/>
             </w:r>
             <w:r>
               <w:rPr>
                 <w:webHidden/>
               </w:rPr>
-              <w:fldChar w:fldCharType="begin"/>
+              <w:instrText xml:space="preserve">PAGEREF _Toc209822161 \h</w:instrText>
             </w:r>
             <w:r>
               <w:rPr>
                 <w:webHidden/>
               </w:rPr>
-              <w:instrText xml:space="preserve">PAGEREF _Toc209822161 \h</w:instrText>
+              <w:fldChar w:fldCharType="separate"/>
             </w:r>
             <w:r>
               <w:rPr>
                 <w:webHidden/>
-              </w:rPr>
-              <w:fldChar w:fldCharType="separate"/>
-            </w:r>
-            <w:r>
-              <w:rPr>
                 <w:rStyle w:val="czeindeksu"/>
                 <w:vanish w:val="false"/>
               </w:rPr>
+              <w:t>Commit projektu do GIT</w:t>
               <w:tab/>
               <w:t>6</w:t>
             </w:r>
@@ -1572,6 +1576,7 @@
               <w:rPr>
                 <w:webHidden/>
                 <w:rStyle w:val="czeindeksu"/>
+                <w:vanish w:val="false"/>
                 <w:lang w:val="pl-PL"/>
               </w:rPr>
               <w:t>Podsumowanie</w:t>
@@ -1708,8 +1713,8 @@
           <w:lang w:val="pl-PL"/>
         </w:rPr>
       </w:pPr>
-      <w:bookmarkStart w:id="3" w:name="_Toc209822151"/>
-      <w:bookmarkStart w:id="4" w:name="_Toc146283465"/>
+      <w:bookmarkStart w:id="3" w:name="_Toc146283465"/>
+      <w:bookmarkStart w:id="4" w:name="_Toc209822151"/>
       <w:r>
         <w:rPr>
           <w:lang w:val="pl-PL"/>
@@ -1758,8 +1763,8 @@
           <w:lang w:val="pl-PL"/>
         </w:rPr>
       </w:pPr>
-      <w:bookmarkStart w:id="5" w:name="_Toc209822152"/>
-      <w:bookmarkStart w:id="6" w:name="_Toc146283466"/>
+      <w:bookmarkStart w:id="5" w:name="_Toc146283466"/>
+      <w:bookmarkStart w:id="6" w:name="_Toc209822152"/>
       <w:r>
         <w:rPr>
           <w:lang w:val="pl-PL"/>
@@ -2192,7 +2197,7 @@
                           <a:noFill/>
                         </a:ln>
                         <a:effectLst>
-                          <a:outerShdw algn="tl" blurRad="291960" dir="2700000" dist="138988" rotWithShape="0">
+                          <a:outerShdw algn="tl" blurRad="291960" dir="2700000" dist="138479" rotWithShape="0">
                             <a:srgbClr val="333333">
                               <a:alpha val="65000"/>
                             </a:srgbClr>
@@ -2268,7 +2273,7 @@
                           <a:noFill/>
                         </a:ln>
                         <a:effectLst>
-                          <a:outerShdw algn="tl" blurRad="291960" dir="2700000" dist="138988" rotWithShape="0">
+                          <a:outerShdw algn="tl" blurRad="291960" dir="2700000" dist="138479" rotWithShape="0">
                             <a:srgbClr val="333333">
                               <a:alpha val="65000"/>
                             </a:srgbClr>
@@ -2325,7 +2330,7 @@
                           <a:noFill/>
                         </a:ln>
                         <a:effectLst>
-                          <a:outerShdw algn="tl" blurRad="291960" dir="2700000" dist="138988" rotWithShape="0">
+                          <a:outerShdw algn="tl" blurRad="291960" dir="2700000" dist="138479" rotWithShape="0">
                             <a:srgbClr val="333333">
                               <a:alpha val="65000"/>
                             </a:srgbClr>
@@ -2411,20 +2416,19 @@
       </w:pPr>
       <w:r>
         <w:rPr/>
-      </w:r>
-    </w:p>
-    <w:p>
-      <w:pPr>
-        <w:pStyle w:val="Zadanie"/>
-        <w:rPr/>
-      </w:pPr>
-      <w:r>
-        <w:rPr/>
         <w:drawing>
-          <wp:inline distT="0" distB="0" distL="0" distR="0">
-            <wp:extent cx="6645910" cy="981075"/>
+          <wp:anchor behindDoc="0" distT="0" distB="0" distL="0" distR="0" simplePos="0" locked="0" layoutInCell="0" allowOverlap="1" relativeHeight="5">
+            <wp:simplePos x="0" y="0"/>
+            <wp:positionH relativeFrom="column">
+              <wp:posOffset>1189355</wp:posOffset>
+            </wp:positionH>
+            <wp:positionV relativeFrom="paragraph">
+              <wp:posOffset>60325</wp:posOffset>
+            </wp:positionV>
+            <wp:extent cx="3810000" cy="1924050"/>
             <wp:effectExtent l="0" t="0" r="0" b="0"/>
-            <wp:docPr id="7" name="Obraz 795903620"/>
+            <wp:wrapSquare wrapText="largest"/>
+            <wp:docPr id="7" name="Obraz1"/>
             <wp:cNvGraphicFramePr>
               <a:graphicFrameLocks xmlns:a="http://schemas.openxmlformats.org/drawingml/2006/main" noChangeAspect="1"/>
             </wp:cNvGraphicFramePr>
@@ -2432,7 +2436,7 @@
               <a:graphicData uri="http://schemas.openxmlformats.org/drawingml/2006/picture">
                 <pic:pic xmlns:pic="http://schemas.openxmlformats.org/drawingml/2006/picture">
                   <pic:nvPicPr>
-                    <pic:cNvPr id="7" name="Obraz 795903620"/>
+                    <pic:cNvPr id="7" name="Obraz1"/>
                     <pic:cNvPicPr>
                       <a:picLocks noChangeAspect="1" noChangeArrowheads="1"/>
                     </pic:cNvPicPr>
@@ -2446,7 +2450,7 @@
                   <pic:spPr bwMode="auto">
                     <a:xfrm>
                       <a:off x="0" y="0"/>
-                      <a:ext cx="6645910" cy="981075"/>
+                      <a:ext cx="3810000" cy="1924050"/>
                     </a:xfrm>
                     <a:prstGeom prst="rect">
                       <a:avLst/>
@@ -2456,8 +2460,89 @@
                 </pic:pic>
               </a:graphicData>
             </a:graphic>
-          </wp:inline>
+          </wp:anchor>
         </w:drawing>
+      </w:r>
+    </w:p>
+    <w:p>
+      <w:pPr>
+        <w:pStyle w:val="Zadanie"/>
+        <w:rPr/>
+      </w:pPr>
+      <w:r>
+        <w:rPr/>
+      </w:r>
+    </w:p>
+    <w:p>
+      <w:pPr>
+        <w:pStyle w:val="Zadanie"/>
+        <w:rPr/>
+      </w:pPr>
+      <w:r>
+        <w:rPr/>
+      </w:r>
+    </w:p>
+    <w:p>
+      <w:pPr>
+        <w:pStyle w:val="Zadanie"/>
+        <w:rPr/>
+      </w:pPr>
+      <w:r>
+        <w:rPr/>
+      </w:r>
+    </w:p>
+    <w:p>
+      <w:pPr>
+        <w:pStyle w:val="Zadanie"/>
+        <w:rPr/>
+      </w:pPr>
+      <w:r>
+        <w:rPr/>
+      </w:r>
+    </w:p>
+    <w:p>
+      <w:pPr>
+        <w:pStyle w:val="Zadanie"/>
+        <w:rPr/>
+      </w:pPr>
+      <w:r>
+        <w:rPr/>
+      </w:r>
+    </w:p>
+    <w:p>
+      <w:pPr>
+        <w:pStyle w:val="Zadanie"/>
+        <w:rPr/>
+      </w:pPr>
+      <w:r>
+        <w:rPr/>
+      </w:r>
+    </w:p>
+    <w:p>
+      <w:pPr>
+        <w:pStyle w:val="Zadanie"/>
+        <w:rPr/>
+      </w:pPr>
+      <w:r>
+        <w:rPr/>
+      </w:r>
+    </w:p>
+    <w:p>
+      <w:pPr>
+        <w:pStyle w:val="Zadanie"/>
+        <w:rPr/>
+      </w:pPr>
+      <w:r>
+        <w:rPr/>
+      </w:r>
+    </w:p>
+    <w:p>
+      <w:pPr>
+        <w:pStyle w:val="Zadanie"/>
+        <w:rPr/>
+      </w:pPr>
+      <w:r>
+        <w:rPr/>
       </w:r>
     </w:p>
     <w:p>
@@ -2485,8 +2570,8 @@
         <w:tblLook w:firstRow="1" w:noVBand="1" w:lastRow="0" w:firstColumn="1" w:lastColumn="0" w:noHBand="0" w:val="04a0"/>
       </w:tblPr>
       <w:tblGrid>
-        <w:gridCol w:w="8195"/>
-        <w:gridCol w:w="1135"/>
+        <w:gridCol w:w="8194"/>
+        <w:gridCol w:w="1136"/>
         <w:gridCol w:w="1136"/>
       </w:tblGrid>
       <w:tr>
@@ -2495,7 +2580,7 @@
         </w:trPr>
         <w:tc>
           <w:tcPr>
-            <w:tcW w:w="8195" w:type="dxa"/>
+            <w:tcW w:w="8194" w:type="dxa"/>
             <w:tcBorders/>
             <w:vAlign w:val="center"/>
           </w:tcPr>
@@ -2503,6 +2588,7 @@
             <w:pPr>
               <w:pStyle w:val="PunktyTabela"/>
               <w:widowControl/>
+              <w:suppressAutoHyphens w:val="true"/>
               <w:spacing w:before="0" w:after="0"/>
               <w:jc w:val="start"/>
               <w:rPr>
@@ -2522,38 +2608,6 @@
                 <w:lang w:eastAsia="en-US" w:bidi="ar-SA"/>
               </w:rPr>
               <w:t>Punkty:</w:t>
-            </w:r>
-          </w:p>
-        </w:tc>
-        <w:tc>
-          <w:tcPr>
-            <w:tcW w:w="1135" w:type="dxa"/>
-            <w:tcBorders/>
-            <w:vAlign w:val="center"/>
-          </w:tcPr>
-          <w:p>
-            <w:pPr>
-              <w:pStyle w:val="PunktyTabela"/>
-              <w:widowControl/>
-              <w:spacing w:before="0" w:after="0"/>
-              <w:jc w:val="center"/>
-              <w:rPr>
-                <w:rFonts w:ascii="Calibri" w:hAnsi="Calibri" w:eastAsia="Calibri" w:cs="Arial"/>
-                <w:kern w:val="2"/>
-                <w:sz w:val="22"/>
-                <w:szCs w:val="22"/>
-                <w:lang w:eastAsia="en-US" w:bidi="ar-SA"/>
-              </w:rPr>
-            </w:pPr>
-            <w:r>
-              <w:rPr>
-                <w:rFonts w:eastAsia="Calibri" w:cs="Arial"/>
-                <w:kern w:val="2"/>
-                <w:sz w:val="22"/>
-                <w:szCs w:val="22"/>
-                <w:lang w:eastAsia="en-US" w:bidi="ar-SA"/>
-              </w:rPr>
-              <w:t>0</w:t>
             </w:r>
           </w:p>
         </w:tc>
@@ -2567,6 +2621,7 @@
             <w:pPr>
               <w:pStyle w:val="PunktyTabela"/>
               <w:widowControl/>
+              <w:suppressAutoHyphens w:val="true"/>
               <w:spacing w:before="0" w:after="0"/>
               <w:jc w:val="center"/>
               <w:rPr>
@@ -2585,6 +2640,39 @@
                 <w:szCs w:val="22"/>
                 <w:lang w:eastAsia="en-US" w:bidi="ar-SA"/>
               </w:rPr>
+              <w:t>0</w:t>
+            </w:r>
+          </w:p>
+        </w:tc>
+        <w:tc>
+          <w:tcPr>
+            <w:tcW w:w="1136" w:type="dxa"/>
+            <w:tcBorders/>
+            <w:vAlign w:val="center"/>
+          </w:tcPr>
+          <w:p>
+            <w:pPr>
+              <w:pStyle w:val="PunktyTabela"/>
+              <w:widowControl/>
+              <w:suppressAutoHyphens w:val="true"/>
+              <w:spacing w:before="0" w:after="0"/>
+              <w:jc w:val="center"/>
+              <w:rPr>
+                <w:rFonts w:ascii="Calibri" w:hAnsi="Calibri" w:eastAsia="Calibri" w:cs="Arial"/>
+                <w:kern w:val="2"/>
+                <w:sz w:val="22"/>
+                <w:szCs w:val="22"/>
+                <w:lang w:eastAsia="en-US" w:bidi="ar-SA"/>
+              </w:rPr>
+            </w:pPr>
+            <w:r>
+              <w:rPr>
+                <w:rFonts w:eastAsia="Calibri" w:cs="Arial"/>
+                <w:kern w:val="2"/>
+                <w:sz w:val="22"/>
+                <w:szCs w:val="22"/>
+                <w:lang w:eastAsia="en-US" w:bidi="ar-SA"/>
+              </w:rPr>
               <w:t>1</w:t>
             </w:r>
           </w:p>
@@ -2789,30 +2877,22 @@
       </w:pPr>
       <w:r>
         <w:rPr/>
-        <w:t>Wstaw zrzut ekranu listy przed dodaniem nowego zadania:</w:t>
-      </w:r>
-    </w:p>
-    <w:p>
-      <w:pPr>
-        <w:pStyle w:val="Zadanie"/>
-        <w:rPr/>
-      </w:pPr>
-      <w:r>
-        <w:rPr/>
-      </w:r>
-    </w:p>
-    <w:p>
-      <w:pPr>
-        <w:pStyle w:val="Zadanie"/>
-        <w:rPr/>
-      </w:pPr>
-      <w:r>
-        <w:rPr/>
+        <w:t xml:space="preserve">Wstaw zrzut ekranu listy </w:t>
+      </w:r>
+      <w:r>
         <w:drawing>
-          <wp:inline distT="0" distB="0" distL="0" distR="0">
-            <wp:extent cx="6645910" cy="981075"/>
+          <wp:anchor behindDoc="0" distT="0" distB="0" distL="0" distR="0" simplePos="0" locked="0" layoutInCell="0" allowOverlap="1" relativeHeight="6">
+            <wp:simplePos x="0" y="0"/>
+            <wp:positionH relativeFrom="column">
+              <wp:posOffset>2751455</wp:posOffset>
+            </wp:positionH>
+            <wp:positionV relativeFrom="paragraph">
+              <wp:posOffset>275590</wp:posOffset>
+            </wp:positionV>
+            <wp:extent cx="3810000" cy="952500"/>
             <wp:effectExtent l="0" t="0" r="0" b="0"/>
-            <wp:docPr id="8" name="Obraz 1191100157"/>
+            <wp:wrapSquare wrapText="largest"/>
+            <wp:docPr id="8" name="Obraz2"/>
             <wp:cNvGraphicFramePr>
               <a:graphicFrameLocks xmlns:a="http://schemas.openxmlformats.org/drawingml/2006/main" noChangeAspect="1"/>
             </wp:cNvGraphicFramePr>
@@ -2820,7 +2900,7 @@
               <a:graphicData uri="http://schemas.openxmlformats.org/drawingml/2006/picture">
                 <pic:pic xmlns:pic="http://schemas.openxmlformats.org/drawingml/2006/picture">
                   <pic:nvPicPr>
-                    <pic:cNvPr id="8" name="Obraz 1191100157"/>
+                    <pic:cNvPr id="8" name="Obraz2"/>
                     <pic:cNvPicPr>
                       <a:picLocks noChangeAspect="1" noChangeArrowheads="1"/>
                     </pic:cNvPicPr>
@@ -2834,7 +2914,7 @@
                   <pic:spPr bwMode="auto">
                     <a:xfrm>
                       <a:off x="0" y="0"/>
-                      <a:ext cx="6645910" cy="981075"/>
+                      <a:ext cx="3810000" cy="952500"/>
                     </a:xfrm>
                     <a:prstGeom prst="rect">
                       <a:avLst/>
@@ -2844,41 +2924,64 @@
                 </pic:pic>
               </a:graphicData>
             </a:graphic>
-          </wp:inline>
+          </wp:anchor>
         </w:drawing>
       </w:r>
-    </w:p>
-    <w:p>
-      <w:pPr>
-        <w:pStyle w:val="Zadanie"/>
-        <w:rPr/>
-      </w:pPr>
-      <w:r>
-        <w:rPr/>
-      </w:r>
-    </w:p>
-    <w:p>
-      <w:pPr>
-        <w:pStyle w:val="Zadanie"/>
-        <w:rPr/>
-      </w:pPr>
-      <w:r>
-        <w:rPr/>
-        <w:t>Wstaw zrzut ekranu listy po dodaniu nowego zadania:</w:t>
-      </w:r>
-    </w:p>
-    <w:p>
-      <w:pPr>
-        <w:pStyle w:val="Zadanie"/>
-        <w:rPr/>
-      </w:pPr>
-      <w:r>
-        <w:rPr/>
+      <w:r>
+        <w:rPr/>
+        <w:t>przed dodaniem nowego zadania:</w:t>
+      </w:r>
+    </w:p>
+    <w:p>
+      <w:pPr>
+        <w:pStyle w:val="Zadanie"/>
+        <w:rPr/>
+      </w:pPr>
+      <w:r>
+        <w:rPr/>
+      </w:r>
+    </w:p>
+    <w:p>
+      <w:pPr>
+        <w:pStyle w:val="Zadanie"/>
+        <w:rPr/>
+      </w:pPr>
+      <w:r>
+        <w:rPr/>
+      </w:r>
+    </w:p>
+    <w:p>
+      <w:pPr>
+        <w:pStyle w:val="Zadanie"/>
+        <w:rPr/>
+      </w:pPr>
+      <w:r>
+        <w:rPr/>
+      </w:r>
+    </w:p>
+    <w:p>
+      <w:pPr>
+        <w:pStyle w:val="Zadanie"/>
+        <w:rPr/>
+      </w:pPr>
+      <w:r>
+        <w:rPr/>
+        <w:t>Wstaw zrzut ekranu listy po dodaniu nowego</w:t>
+      </w:r>
+      <w:r>
         <w:drawing>
-          <wp:inline distT="0" distB="0" distL="0" distR="0">
-            <wp:extent cx="6645910" cy="981075"/>
+          <wp:anchor behindDoc="0" distT="0" distB="0" distL="0" distR="0" simplePos="0" locked="0" layoutInCell="0" allowOverlap="1" relativeHeight="7">
+            <wp:simplePos x="0" y="0"/>
+            <wp:positionH relativeFrom="column">
+              <wp:posOffset>2722880</wp:posOffset>
+            </wp:positionH>
+            <wp:positionV relativeFrom="paragraph">
+              <wp:posOffset>152400</wp:posOffset>
+            </wp:positionV>
+            <wp:extent cx="3810000" cy="1438275"/>
             <wp:effectExtent l="0" t="0" r="0" b="0"/>
-            <wp:docPr id="9" name="Obraz 2106864032"/>
+            <wp:wrapSquare wrapText="largest"/>
+            <wp:docPr id="9" name="Obraz3"/>
             <wp:cNvGraphicFramePr>
               <a:graphicFrameLocks xmlns:a="http://schemas.openxmlformats.org/drawingml/2006/main" noChangeAspect="1"/>
             </wp:cNvGraphicFramePr>
@@ -2886,7 +2989,7 @@
               <a:graphicData uri="http://schemas.openxmlformats.org/drawingml/2006/picture">
                 <pic:pic xmlns:pic="http://schemas.openxmlformats.org/drawingml/2006/picture">
                   <pic:nvPicPr>
-                    <pic:cNvPr id="9" name="Obraz 2106864032"/>
+                    <pic:cNvPr id="9" name="Obraz3"/>
                     <pic:cNvPicPr>
                       <a:picLocks noChangeAspect="1" noChangeArrowheads="1"/>
                     </pic:cNvPicPr>
@@ -2900,7 +3003,7 @@
                   <pic:spPr bwMode="auto">
                     <a:xfrm>
                       <a:off x="0" y="0"/>
-                      <a:ext cx="6645910" cy="981075"/>
+                      <a:ext cx="3810000" cy="1438275"/>
                     </a:xfrm>
                     <a:prstGeom prst="rect">
                       <a:avLst/>
@@ -2910,8 +3013,66 @@
                 </pic:pic>
               </a:graphicData>
             </a:graphic>
-          </wp:inline>
+          </wp:anchor>
         </w:drawing>
+      </w:r>
+      <w:r>
+        <w:rPr/>
+        <w:t xml:space="preserve"> zadania:</w:t>
+      </w:r>
+    </w:p>
+    <w:p>
+      <w:pPr>
+        <w:pStyle w:val="Zadanie"/>
+        <w:rPr/>
+      </w:pPr>
+      <w:r>
+        <w:rPr/>
+      </w:r>
+    </w:p>
+    <w:p>
+      <w:pPr>
+        <w:pStyle w:val="Zadanie"/>
+        <w:rPr/>
+      </w:pPr>
+      <w:r>
+        <w:rPr/>
+      </w:r>
+    </w:p>
+    <w:p>
+      <w:pPr>
+        <w:pStyle w:val="Zadanie"/>
+        <w:rPr/>
+      </w:pPr>
+      <w:r>
+        <w:rPr/>
+      </w:r>
+    </w:p>
+    <w:p>
+      <w:pPr>
+        <w:pStyle w:val="Zadanie"/>
+        <w:rPr/>
+      </w:pPr>
+      <w:r>
+        <w:rPr/>
+      </w:r>
+    </w:p>
+    <w:p>
+      <w:pPr>
+        <w:pStyle w:val="Zadanie"/>
+        <w:rPr/>
+      </w:pPr>
+      <w:r>
+        <w:rPr/>
+      </w:r>
+    </w:p>
+    <w:p>
+      <w:pPr>
+        <w:pStyle w:val="Zadanie"/>
+        <w:rPr/>
+      </w:pPr>
+      <w:r>
+        <w:rPr/>
       </w:r>
     </w:p>
     <w:tbl>
@@ -2930,8 +3091,8 @@
         <w:tblLook w:firstRow="1" w:noVBand="1" w:lastRow="0" w:firstColumn="1" w:lastColumn="0" w:noHBand="0" w:val="04a0"/>
       </w:tblPr>
       <w:tblGrid>
-        <w:gridCol w:w="8195"/>
-        <w:gridCol w:w="1135"/>
+        <w:gridCol w:w="8194"/>
+        <w:gridCol w:w="1136"/>
         <w:gridCol w:w="1136"/>
       </w:tblGrid>
       <w:tr>
@@ -2940,7 +3101,7 @@
         </w:trPr>
         <w:tc>
           <w:tcPr>
-            <w:tcW w:w="8195" w:type="dxa"/>
+            <w:tcW w:w="8194" w:type="dxa"/>
             <w:tcBorders/>
             <w:vAlign w:val="center"/>
           </w:tcPr>
@@ -2948,6 +3109,7 @@
             <w:pPr>
               <w:pStyle w:val="PunktyTabela"/>
               <w:widowControl/>
+              <w:suppressAutoHyphens w:val="true"/>
               <w:spacing w:before="0" w:after="0"/>
               <w:jc w:val="start"/>
               <w:rPr>
@@ -2967,38 +3129,6 @@
                 <w:lang w:eastAsia="en-US" w:bidi="ar-SA"/>
               </w:rPr>
               <w:t>Punkty:</w:t>
-            </w:r>
-          </w:p>
-        </w:tc>
-        <w:tc>
-          <w:tcPr>
-            <w:tcW w:w="1135" w:type="dxa"/>
-            <w:tcBorders/>
-            <w:vAlign w:val="center"/>
-          </w:tcPr>
-          <w:p>
-            <w:pPr>
-              <w:pStyle w:val="PunktyTabela"/>
-              <w:widowControl/>
-              <w:spacing w:before="0" w:after="0"/>
-              <w:jc w:val="center"/>
-              <w:rPr>
-                <w:rFonts w:ascii="Calibri" w:hAnsi="Calibri" w:eastAsia="Calibri" w:cs="Arial"/>
-                <w:kern w:val="2"/>
-                <w:sz w:val="22"/>
-                <w:szCs w:val="22"/>
-                <w:lang w:eastAsia="en-US" w:bidi="ar-SA"/>
-              </w:rPr>
-            </w:pPr>
-            <w:r>
-              <w:rPr>
-                <w:rFonts w:eastAsia="Calibri" w:cs="Arial"/>
-                <w:kern w:val="2"/>
-                <w:sz w:val="22"/>
-                <w:szCs w:val="22"/>
-                <w:lang w:eastAsia="en-US" w:bidi="ar-SA"/>
-              </w:rPr>
-              <w:t>0</w:t>
             </w:r>
           </w:p>
         </w:tc>
@@ -3012,6 +3142,7 @@
             <w:pPr>
               <w:pStyle w:val="PunktyTabela"/>
               <w:widowControl/>
+              <w:suppressAutoHyphens w:val="true"/>
               <w:spacing w:before="0" w:after="0"/>
               <w:jc w:val="center"/>
               <w:rPr>
@@ -3030,6 +3161,39 @@
                 <w:szCs w:val="22"/>
                 <w:lang w:eastAsia="en-US" w:bidi="ar-SA"/>
               </w:rPr>
+              <w:t>0</w:t>
+            </w:r>
+          </w:p>
+        </w:tc>
+        <w:tc>
+          <w:tcPr>
+            <w:tcW w:w="1136" w:type="dxa"/>
+            <w:tcBorders/>
+            <w:vAlign w:val="center"/>
+          </w:tcPr>
+          <w:p>
+            <w:pPr>
+              <w:pStyle w:val="PunktyTabela"/>
+              <w:widowControl/>
+              <w:suppressAutoHyphens w:val="true"/>
+              <w:spacing w:before="0" w:after="0"/>
+              <w:jc w:val="center"/>
+              <w:rPr>
+                <w:rFonts w:ascii="Calibri" w:hAnsi="Calibri" w:eastAsia="Calibri" w:cs="Arial"/>
+                <w:kern w:val="2"/>
+                <w:sz w:val="22"/>
+                <w:szCs w:val="22"/>
+                <w:lang w:eastAsia="en-US" w:bidi="ar-SA"/>
+              </w:rPr>
+            </w:pPr>
+            <w:r>
+              <w:rPr>
+                <w:rFonts w:eastAsia="Calibri" w:cs="Arial"/>
+                <w:kern w:val="2"/>
+                <w:sz w:val="22"/>
+                <w:szCs w:val="22"/>
+                <w:lang w:eastAsia="en-US" w:bidi="ar-SA"/>
+              </w:rPr>
               <w:t>1</w:t>
             </w:r>
           </w:p>
@@ -3079,10 +3243,18 @@
       <w:r>
         <w:rPr/>
         <w:drawing>
-          <wp:inline distT="0" distB="0" distL="0" distR="0">
-            <wp:extent cx="6645910" cy="981075"/>
+          <wp:anchor behindDoc="0" distT="0" distB="0" distL="0" distR="0" simplePos="0" locked="0" layoutInCell="0" allowOverlap="1" relativeHeight="8">
+            <wp:simplePos x="0" y="0"/>
+            <wp:positionH relativeFrom="column">
+              <wp:posOffset>1417955</wp:posOffset>
+            </wp:positionH>
+            <wp:positionV relativeFrom="paragraph">
+              <wp:posOffset>12700</wp:posOffset>
+            </wp:positionV>
+            <wp:extent cx="3810000" cy="2409825"/>
             <wp:effectExtent l="0" t="0" r="0" b="0"/>
-            <wp:docPr id="10" name="Obraz 1607113082"/>
+            <wp:wrapSquare wrapText="largest"/>
+            <wp:docPr id="10" name="Obraz4"/>
             <wp:cNvGraphicFramePr>
               <a:graphicFrameLocks xmlns:a="http://schemas.openxmlformats.org/drawingml/2006/main" noChangeAspect="1"/>
             </wp:cNvGraphicFramePr>
@@ -3090,7 +3262,7 @@
               <a:graphicData uri="http://schemas.openxmlformats.org/drawingml/2006/picture">
                 <pic:pic xmlns:pic="http://schemas.openxmlformats.org/drawingml/2006/picture">
                   <pic:nvPicPr>
-                    <pic:cNvPr id="10" name="Obraz 1607113082"/>
+                    <pic:cNvPr id="10" name="Obraz4"/>
                     <pic:cNvPicPr>
                       <a:picLocks noChangeAspect="1" noChangeArrowheads="1"/>
                     </pic:cNvPicPr>
@@ -3104,7 +3276,7 @@
                   <pic:spPr bwMode="auto">
                     <a:xfrm>
                       <a:off x="0" y="0"/>
-                      <a:ext cx="6645910" cy="981075"/>
+                      <a:ext cx="3810000" cy="2409825"/>
                     </a:xfrm>
                     <a:prstGeom prst="rect">
                       <a:avLst/>
@@ -3114,7 +3286,7 @@
                 </pic:pic>
               </a:graphicData>
             </a:graphic>
-          </wp:inline>
+          </wp:anchor>
         </w:drawing>
       </w:r>
     </w:p>
@@ -3134,6 +3306,114 @@
       </w:pPr>
       <w:r>
         <w:rPr/>
+      </w:r>
+    </w:p>
+    <w:p>
+      <w:pPr>
+        <w:pStyle w:val="Zadanie"/>
+        <w:rPr/>
+      </w:pPr>
+      <w:r>
+        <w:rPr/>
+      </w:r>
+    </w:p>
+    <w:p>
+      <w:pPr>
+        <w:pStyle w:val="Zadanie"/>
+        <w:rPr/>
+      </w:pPr>
+      <w:r>
+        <w:rPr/>
+      </w:r>
+    </w:p>
+    <w:p>
+      <w:pPr>
+        <w:pStyle w:val="Zadanie"/>
+        <w:rPr/>
+      </w:pPr>
+      <w:r>
+        <w:rPr/>
+      </w:r>
+    </w:p>
+    <w:p>
+      <w:pPr>
+        <w:pStyle w:val="Zadanie"/>
+        <w:rPr/>
+      </w:pPr>
+      <w:r>
+        <w:rPr/>
+      </w:r>
+    </w:p>
+    <w:p>
+      <w:pPr>
+        <w:pStyle w:val="Zadanie"/>
+        <w:rPr/>
+      </w:pPr>
+      <w:r>
+        <w:rPr/>
+      </w:r>
+    </w:p>
+    <w:p>
+      <w:pPr>
+        <w:pStyle w:val="Zadanie"/>
+        <w:rPr/>
+      </w:pPr>
+      <w:r>
+        <w:rPr/>
+      </w:r>
+    </w:p>
+    <w:p>
+      <w:pPr>
+        <w:pStyle w:val="Zadanie"/>
+        <w:rPr/>
+      </w:pPr>
+      <w:r>
+        <w:rPr/>
+      </w:r>
+    </w:p>
+    <w:p>
+      <w:pPr>
+        <w:pStyle w:val="Zadanie"/>
+        <w:rPr/>
+      </w:pPr>
+      <w:r>
+        <w:rPr/>
+      </w:r>
+    </w:p>
+    <w:p>
+      <w:pPr>
+        <w:pStyle w:val="Zadanie"/>
+        <w:rPr/>
+      </w:pPr>
+      <w:r>
+        <w:rPr/>
+      </w:r>
+    </w:p>
+    <w:p>
+      <w:pPr>
+        <w:pStyle w:val="Zadanie"/>
+        <w:rPr/>
+      </w:pPr>
+      <w:r>
+        <w:rPr/>
+      </w:r>
+    </w:p>
+    <w:p>
+      <w:pPr>
+        <w:pStyle w:val="Zadanie"/>
+        <w:rPr/>
+      </w:pPr>
+      <w:r>
+        <w:rPr/>
+      </w:r>
+    </w:p>
+    <w:p>
+      <w:pPr>
+        <w:pStyle w:val="Zadanie"/>
+        <w:rPr/>
+      </w:pPr>
+      <w:r>
+        <w:rPr/>
         <w:t>Wstaw zrzut ekranu listy po usunięciu zadania:</w:t>
       </w:r>
     </w:p>
@@ -3144,11 +3424,28 @@
       </w:pPr>
       <w:r>
         <w:rPr/>
+      </w:r>
+    </w:p>
+    <w:p>
+      <w:pPr>
+        <w:pStyle w:val="Zadanie"/>
+        <w:rPr/>
+      </w:pPr>
+      <w:r>
+        <w:rPr/>
         <w:drawing>
-          <wp:inline distT="0" distB="0" distL="0" distR="0">
-            <wp:extent cx="6645910" cy="981075"/>
+          <wp:anchor behindDoc="0" distT="0" distB="0" distL="0" distR="0" simplePos="0" locked="0" layoutInCell="0" allowOverlap="1" relativeHeight="9">
+            <wp:simplePos x="0" y="0"/>
+            <wp:positionH relativeFrom="column">
+              <wp:align>center</wp:align>
+            </wp:positionH>
+            <wp:positionV relativeFrom="paragraph">
+              <wp:posOffset>635</wp:posOffset>
+            </wp:positionV>
+            <wp:extent cx="3810000" cy="1924050"/>
             <wp:effectExtent l="0" t="0" r="0" b="0"/>
-            <wp:docPr id="11" name="Obraz 448594123"/>
+            <wp:wrapSquare wrapText="largest"/>
+            <wp:docPr id="11" name="Obraz5"/>
             <wp:cNvGraphicFramePr>
               <a:graphicFrameLocks xmlns:a="http://schemas.openxmlformats.org/drawingml/2006/main" noChangeAspect="1"/>
             </wp:cNvGraphicFramePr>
@@ -3156,7 +3453,7 @@
               <a:graphicData uri="http://schemas.openxmlformats.org/drawingml/2006/picture">
                 <pic:pic xmlns:pic="http://schemas.openxmlformats.org/drawingml/2006/picture">
                   <pic:nvPicPr>
-                    <pic:cNvPr id="11" name="Obraz 448594123"/>
+                    <pic:cNvPr id="11" name="Obraz5"/>
                     <pic:cNvPicPr>
                       <a:picLocks noChangeAspect="1" noChangeArrowheads="1"/>
                     </pic:cNvPicPr>
@@ -3170,7 +3467,7 @@
                   <pic:spPr bwMode="auto">
                     <a:xfrm>
                       <a:off x="0" y="0"/>
-                      <a:ext cx="6645910" cy="981075"/>
+                      <a:ext cx="3810000" cy="1924050"/>
                     </a:xfrm>
                     <a:prstGeom prst="rect">
                       <a:avLst/>
@@ -3180,8 +3477,98 @@
                 </pic:pic>
               </a:graphicData>
             </a:graphic>
-          </wp:inline>
+          </wp:anchor>
         </w:drawing>
+      </w:r>
+    </w:p>
+    <w:p>
+      <w:pPr>
+        <w:pStyle w:val="Zadanie"/>
+        <w:rPr/>
+      </w:pPr>
+      <w:r>
+        <w:rPr/>
+      </w:r>
+    </w:p>
+    <w:p>
+      <w:pPr>
+        <w:pStyle w:val="Zadanie"/>
+        <w:rPr/>
+      </w:pPr>
+      <w:r>
+        <w:rPr/>
+      </w:r>
+    </w:p>
+    <w:p>
+      <w:pPr>
+        <w:pStyle w:val="Zadanie"/>
+        <w:rPr/>
+      </w:pPr>
+      <w:r>
+        <w:rPr/>
+      </w:r>
+    </w:p>
+    <w:p>
+      <w:pPr>
+        <w:pStyle w:val="Zadanie"/>
+        <w:rPr/>
+      </w:pPr>
+      <w:r>
+        <w:rPr/>
+      </w:r>
+    </w:p>
+    <w:p>
+      <w:pPr>
+        <w:pStyle w:val="Zadanie"/>
+        <w:rPr/>
+      </w:pPr>
+      <w:r>
+        <w:rPr/>
+      </w:r>
+    </w:p>
+    <w:p>
+      <w:pPr>
+        <w:pStyle w:val="Zadanie"/>
+        <w:rPr/>
+      </w:pPr>
+      <w:r>
+        <w:rPr/>
+      </w:r>
+    </w:p>
+    <w:p>
+      <w:pPr>
+        <w:pStyle w:val="Zadanie"/>
+        <w:rPr/>
+      </w:pPr>
+      <w:r>
+        <w:rPr/>
+      </w:r>
+    </w:p>
+    <w:p>
+      <w:pPr>
+        <w:pStyle w:val="Zadanie"/>
+        <w:rPr/>
+      </w:pPr>
+      <w:r>
+        <w:rPr/>
+      </w:r>
+    </w:p>
+    <w:p>
+      <w:pPr>
+        <w:pStyle w:val="Zadanie"/>
+        <w:rPr/>
+      </w:pPr>
+      <w:r>
+        <w:rPr/>
+      </w:r>
+    </w:p>
+    <w:p>
+      <w:pPr>
+        <w:pStyle w:val="Zadanie"/>
+        <w:rPr/>
+      </w:pPr>
+      <w:r>
+        <w:rPr/>
       </w:r>
     </w:p>
     <w:tbl>
@@ -3200,8 +3587,8 @@
         <w:tblLook w:firstRow="1" w:noVBand="1" w:lastRow="0" w:firstColumn="1" w:lastColumn="0" w:noHBand="0" w:val="04a0"/>
       </w:tblPr>
       <w:tblGrid>
-        <w:gridCol w:w="8195"/>
-        <w:gridCol w:w="1135"/>
+        <w:gridCol w:w="8194"/>
+        <w:gridCol w:w="1136"/>
         <w:gridCol w:w="1136"/>
       </w:tblGrid>
       <w:tr>
@@ -3210,7 +3597,7 @@
         </w:trPr>
         <w:tc>
           <w:tcPr>
-            <w:tcW w:w="8195" w:type="dxa"/>
+            <w:tcW w:w="8194" w:type="dxa"/>
             <w:tcBorders/>
             <w:vAlign w:val="center"/>
           </w:tcPr>
@@ -3218,6 +3605,7 @@
             <w:pPr>
               <w:pStyle w:val="PunktyTabela"/>
               <w:widowControl/>
+              <w:suppressAutoHyphens w:val="true"/>
               <w:spacing w:before="0" w:after="0"/>
               <w:jc w:val="start"/>
               <w:rPr>
@@ -3237,38 +3625,6 @@
                 <w:lang w:eastAsia="en-US" w:bidi="ar-SA"/>
               </w:rPr>
               <w:t>Punkty:</w:t>
-            </w:r>
-          </w:p>
-        </w:tc>
-        <w:tc>
-          <w:tcPr>
-            <w:tcW w:w="1135" w:type="dxa"/>
-            <w:tcBorders/>
-            <w:vAlign w:val="center"/>
-          </w:tcPr>
-          <w:p>
-            <w:pPr>
-              <w:pStyle w:val="PunktyTabela"/>
-              <w:widowControl/>
-              <w:spacing w:before="0" w:after="0"/>
-              <w:jc w:val="center"/>
-              <w:rPr>
-                <w:rFonts w:ascii="Calibri" w:hAnsi="Calibri" w:eastAsia="Calibri" w:cs="Arial"/>
-                <w:kern w:val="2"/>
-                <w:sz w:val="22"/>
-                <w:szCs w:val="22"/>
-                <w:lang w:eastAsia="en-US" w:bidi="ar-SA"/>
-              </w:rPr>
-            </w:pPr>
-            <w:r>
-              <w:rPr>
-                <w:rFonts w:eastAsia="Calibri" w:cs="Arial"/>
-                <w:kern w:val="2"/>
-                <w:sz w:val="22"/>
-                <w:szCs w:val="22"/>
-                <w:lang w:eastAsia="en-US" w:bidi="ar-SA"/>
-              </w:rPr>
-              <w:t>0</w:t>
             </w:r>
           </w:p>
         </w:tc>
@@ -3282,6 +3638,7 @@
             <w:pPr>
               <w:pStyle w:val="PunktyTabela"/>
               <w:widowControl/>
+              <w:suppressAutoHyphens w:val="true"/>
               <w:spacing w:before="0" w:after="0"/>
               <w:jc w:val="center"/>
               <w:rPr>
@@ -3300,6 +3657,39 @@
                 <w:szCs w:val="22"/>
                 <w:lang w:eastAsia="en-US" w:bidi="ar-SA"/>
               </w:rPr>
+              <w:t>0</w:t>
+            </w:r>
+          </w:p>
+        </w:tc>
+        <w:tc>
+          <w:tcPr>
+            <w:tcW w:w="1136" w:type="dxa"/>
+            <w:tcBorders/>
+            <w:vAlign w:val="center"/>
+          </w:tcPr>
+          <w:p>
+            <w:pPr>
+              <w:pStyle w:val="PunktyTabela"/>
+              <w:widowControl/>
+              <w:suppressAutoHyphens w:val="true"/>
+              <w:spacing w:before="0" w:after="0"/>
+              <w:jc w:val="center"/>
+              <w:rPr>
+                <w:rFonts w:ascii="Calibri" w:hAnsi="Calibri" w:eastAsia="Calibri" w:cs="Arial"/>
+                <w:kern w:val="2"/>
+                <w:sz w:val="22"/>
+                <w:szCs w:val="22"/>
+                <w:lang w:eastAsia="en-US" w:bidi="ar-SA"/>
+              </w:rPr>
+            </w:pPr>
+            <w:r>
+              <w:rPr>
+                <w:rFonts w:eastAsia="Calibri" w:cs="Arial"/>
+                <w:kern w:val="2"/>
+                <w:sz w:val="22"/>
+                <w:szCs w:val="22"/>
+                <w:lang w:eastAsia="en-US" w:bidi="ar-SA"/>
+              </w:rPr>
               <w:t>1</w:t>
             </w:r>
           </w:p>
@@ -3339,20 +3729,19 @@
       </w:pPr>
       <w:r>
         <w:rPr/>
-      </w:r>
-    </w:p>
-    <w:p>
-      <w:pPr>
-        <w:pStyle w:val="Zadanie"/>
-        <w:rPr/>
-      </w:pPr>
-      <w:r>
-        <w:rPr/>
         <w:drawing>
-          <wp:inline distT="0" distB="0" distL="0" distR="0">
-            <wp:extent cx="6645910" cy="981075"/>
+          <wp:anchor behindDoc="0" distT="0" distB="0" distL="0" distR="0" simplePos="0" locked="0" layoutInCell="0" allowOverlap="1" relativeHeight="10">
+            <wp:simplePos x="0" y="0"/>
+            <wp:positionH relativeFrom="column">
+              <wp:align>center</wp:align>
+            </wp:positionH>
+            <wp:positionV relativeFrom="paragraph">
+              <wp:posOffset>635</wp:posOffset>
+            </wp:positionV>
+            <wp:extent cx="3810000" cy="1924050"/>
             <wp:effectExtent l="0" t="0" r="0" b="0"/>
-            <wp:docPr id="12" name="Obraz 704537567"/>
+            <wp:wrapSquare wrapText="largest"/>
+            <wp:docPr id="12" name="Obraz6"/>
             <wp:cNvGraphicFramePr>
               <a:graphicFrameLocks xmlns:a="http://schemas.openxmlformats.org/drawingml/2006/main" noChangeAspect="1"/>
             </wp:cNvGraphicFramePr>
@@ -3360,7 +3749,7 @@
               <a:graphicData uri="http://schemas.openxmlformats.org/drawingml/2006/picture">
                 <pic:pic xmlns:pic="http://schemas.openxmlformats.org/drawingml/2006/picture">
                   <pic:nvPicPr>
-                    <pic:cNvPr id="12" name="Obraz 704537567"/>
+                    <pic:cNvPr id="12" name="Obraz6"/>
                     <pic:cNvPicPr>
                       <a:picLocks noChangeAspect="1" noChangeArrowheads="1"/>
                     </pic:cNvPicPr>
@@ -3374,7 +3763,7 @@
                   <pic:spPr bwMode="auto">
                     <a:xfrm>
                       <a:off x="0" y="0"/>
-                      <a:ext cx="6645910" cy="981075"/>
+                      <a:ext cx="3810000" cy="1924050"/>
                     </a:xfrm>
                     <a:prstGeom prst="rect">
                       <a:avLst/>
@@ -3384,7 +3773,7 @@
                 </pic:pic>
               </a:graphicData>
             </a:graphic>
-          </wp:inline>
+          </wp:anchor>
         </w:drawing>
       </w:r>
     </w:p>
@@ -3404,6 +3793,87 @@
       </w:pPr>
       <w:r>
         <w:rPr/>
+      </w:r>
+    </w:p>
+    <w:p>
+      <w:pPr>
+        <w:pStyle w:val="Zadanie"/>
+        <w:rPr/>
+      </w:pPr>
+      <w:r>
+        <w:rPr/>
+      </w:r>
+    </w:p>
+    <w:p>
+      <w:pPr>
+        <w:pStyle w:val="Zadanie"/>
+        <w:rPr/>
+      </w:pPr>
+      <w:r>
+        <w:rPr/>
+      </w:r>
+    </w:p>
+    <w:p>
+      <w:pPr>
+        <w:pStyle w:val="Zadanie"/>
+        <w:rPr/>
+      </w:pPr>
+      <w:r>
+        <w:rPr/>
+      </w:r>
+    </w:p>
+    <w:p>
+      <w:pPr>
+        <w:pStyle w:val="Zadanie"/>
+        <w:rPr/>
+      </w:pPr>
+      <w:r>
+        <w:rPr/>
+      </w:r>
+    </w:p>
+    <w:p>
+      <w:pPr>
+        <w:pStyle w:val="Zadanie"/>
+        <w:rPr/>
+      </w:pPr>
+      <w:r>
+        <w:rPr/>
+      </w:r>
+    </w:p>
+    <w:p>
+      <w:pPr>
+        <w:pStyle w:val="Zadanie"/>
+        <w:rPr/>
+      </w:pPr>
+      <w:r>
+        <w:rPr/>
+      </w:r>
+    </w:p>
+    <w:p>
+      <w:pPr>
+        <w:pStyle w:val="Zadanie"/>
+        <w:rPr/>
+      </w:pPr>
+      <w:r>
+        <w:rPr/>
+      </w:r>
+    </w:p>
+    <w:p>
+      <w:pPr>
+        <w:pStyle w:val="Zadanie"/>
+        <w:rPr/>
+      </w:pPr>
+      <w:r>
+        <w:rPr/>
+      </w:r>
+    </w:p>
+    <w:p>
+      <w:pPr>
+        <w:pStyle w:val="Zadanie"/>
+        <w:rPr/>
+      </w:pPr>
+      <w:r>
+        <w:rPr/>
         <w:t>Wstaw zrzut ekranu listy w trakcie edytowania zadania i daty:</w:t>
       </w:r>
     </w:p>
@@ -3415,10 +3885,18 @@
       <w:r>
         <w:rPr/>
         <w:drawing>
-          <wp:inline distT="0" distB="0" distL="0" distR="0">
-            <wp:extent cx="6645910" cy="981075"/>
+          <wp:anchor behindDoc="0" distT="0" distB="0" distL="0" distR="0" simplePos="0" locked="0" layoutInCell="0" allowOverlap="1" relativeHeight="11">
+            <wp:simplePos x="0" y="0"/>
+            <wp:positionH relativeFrom="column">
+              <wp:align>center</wp:align>
+            </wp:positionH>
+            <wp:positionV relativeFrom="paragraph">
+              <wp:posOffset>635</wp:posOffset>
+            </wp:positionV>
+            <wp:extent cx="3810000" cy="1924050"/>
             <wp:effectExtent l="0" t="0" r="0" b="0"/>
-            <wp:docPr id="13" name="Obraz 885105259"/>
+            <wp:wrapSquare wrapText="largest"/>
+            <wp:docPr id="13" name="Obraz7"/>
             <wp:cNvGraphicFramePr>
               <a:graphicFrameLocks xmlns:a="http://schemas.openxmlformats.org/drawingml/2006/main" noChangeAspect="1"/>
             </wp:cNvGraphicFramePr>
@@ -3426,7 +3904,7 @@
               <a:graphicData uri="http://schemas.openxmlformats.org/drawingml/2006/picture">
                 <pic:pic xmlns:pic="http://schemas.openxmlformats.org/drawingml/2006/picture">
                   <pic:nvPicPr>
-                    <pic:cNvPr id="13" name="Obraz 885105259"/>
+                    <pic:cNvPr id="13" name="Obraz7"/>
                     <pic:cNvPicPr>
                       <a:picLocks noChangeAspect="1" noChangeArrowheads="1"/>
                     </pic:cNvPicPr>
@@ -3440,7 +3918,7 @@
                   <pic:spPr bwMode="auto">
                     <a:xfrm>
                       <a:off x="0" y="0"/>
-                      <a:ext cx="6645910" cy="981075"/>
+                      <a:ext cx="3810000" cy="1924050"/>
                     </a:xfrm>
                     <a:prstGeom prst="rect">
                       <a:avLst/>
@@ -3450,7 +3928,7 @@
                 </pic:pic>
               </a:graphicData>
             </a:graphic>
-          </wp:inline>
+          </wp:anchor>
         </w:drawing>
       </w:r>
     </w:p>
@@ -3470,6 +3948,87 @@
       </w:pPr>
       <w:r>
         <w:rPr/>
+      </w:r>
+    </w:p>
+    <w:p>
+      <w:pPr>
+        <w:pStyle w:val="Zadanie"/>
+        <w:rPr/>
+      </w:pPr>
+      <w:r>
+        <w:rPr/>
+      </w:r>
+    </w:p>
+    <w:p>
+      <w:pPr>
+        <w:pStyle w:val="Zadanie"/>
+        <w:rPr/>
+      </w:pPr>
+      <w:r>
+        <w:rPr/>
+      </w:r>
+    </w:p>
+    <w:p>
+      <w:pPr>
+        <w:pStyle w:val="Zadanie"/>
+        <w:rPr/>
+      </w:pPr>
+      <w:r>
+        <w:rPr/>
+      </w:r>
+    </w:p>
+    <w:p>
+      <w:pPr>
+        <w:pStyle w:val="Zadanie"/>
+        <w:rPr/>
+      </w:pPr>
+      <w:r>
+        <w:rPr/>
+      </w:r>
+    </w:p>
+    <w:p>
+      <w:pPr>
+        <w:pStyle w:val="Zadanie"/>
+        <w:rPr/>
+      </w:pPr>
+      <w:r>
+        <w:rPr/>
+      </w:r>
+    </w:p>
+    <w:p>
+      <w:pPr>
+        <w:pStyle w:val="Zadanie"/>
+        <w:rPr/>
+      </w:pPr>
+      <w:r>
+        <w:rPr/>
+      </w:r>
+    </w:p>
+    <w:p>
+      <w:pPr>
+        <w:pStyle w:val="Zadanie"/>
+        <w:rPr/>
+      </w:pPr>
+      <w:r>
+        <w:rPr/>
+      </w:r>
+    </w:p>
+    <w:p>
+      <w:pPr>
+        <w:pStyle w:val="Zadanie"/>
+        <w:rPr/>
+      </w:pPr>
+      <w:r>
+        <w:rPr/>
+      </w:r>
+    </w:p>
+    <w:p>
+      <w:pPr>
+        <w:pStyle w:val="Zadanie"/>
+        <w:rPr/>
+      </w:pPr>
+      <w:r>
+        <w:rPr/>
         <w:t>Wstaw zrzut ekranu listy po edycji zadania i daty. Upewnij się, że dane się zapisały i zadanie jest zmienione:</w:t>
       </w:r>
     </w:p>
@@ -3480,11 +4039,28 @@
       </w:pPr>
       <w:r>
         <w:rPr/>
+      </w:r>
+    </w:p>
+    <w:p>
+      <w:pPr>
+        <w:pStyle w:val="Zadanie"/>
+        <w:rPr/>
+      </w:pPr>
+      <w:r>
+        <w:rPr/>
         <w:drawing>
-          <wp:inline distT="0" distB="0" distL="0" distR="0">
-            <wp:extent cx="6645910" cy="981075"/>
+          <wp:anchor behindDoc="0" distT="0" distB="0" distL="0" distR="0" simplePos="0" locked="0" layoutInCell="0" allowOverlap="1" relativeHeight="12">
+            <wp:simplePos x="0" y="0"/>
+            <wp:positionH relativeFrom="column">
+              <wp:align>center</wp:align>
+            </wp:positionH>
+            <wp:positionV relativeFrom="paragraph">
+              <wp:posOffset>635</wp:posOffset>
+            </wp:positionV>
+            <wp:extent cx="3810000" cy="1924050"/>
             <wp:effectExtent l="0" t="0" r="0" b="0"/>
-            <wp:docPr id="14" name="Obraz 1757405639"/>
+            <wp:wrapSquare wrapText="largest"/>
+            <wp:docPr id="14" name="Obraz8"/>
             <wp:cNvGraphicFramePr>
               <a:graphicFrameLocks xmlns:a="http://schemas.openxmlformats.org/drawingml/2006/main" noChangeAspect="1"/>
             </wp:cNvGraphicFramePr>
@@ -3492,7 +4068,7 @@
               <a:graphicData uri="http://schemas.openxmlformats.org/drawingml/2006/picture">
                 <pic:pic xmlns:pic="http://schemas.openxmlformats.org/drawingml/2006/picture">
                   <pic:nvPicPr>
-                    <pic:cNvPr id="14" name="Obraz 1757405639"/>
+                    <pic:cNvPr id="14" name="Obraz8"/>
                     <pic:cNvPicPr>
                       <a:picLocks noChangeAspect="1" noChangeArrowheads="1"/>
                     </pic:cNvPicPr>
@@ -3506,7 +4082,7 @@
                   <pic:spPr bwMode="auto">
                     <a:xfrm>
                       <a:off x="0" y="0"/>
-                      <a:ext cx="6645910" cy="981075"/>
+                      <a:ext cx="3810000" cy="1924050"/>
                     </a:xfrm>
                     <a:prstGeom prst="rect">
                       <a:avLst/>
@@ -3516,8 +4092,89 @@
                 </pic:pic>
               </a:graphicData>
             </a:graphic>
-          </wp:inline>
+          </wp:anchor>
         </w:drawing>
+      </w:r>
+    </w:p>
+    <w:p>
+      <w:pPr>
+        <w:pStyle w:val="Zadanie"/>
+        <w:rPr/>
+      </w:pPr>
+      <w:r>
+        <w:rPr/>
+      </w:r>
+    </w:p>
+    <w:p>
+      <w:pPr>
+        <w:pStyle w:val="Zadanie"/>
+        <w:rPr/>
+      </w:pPr>
+      <w:r>
+        <w:rPr/>
+      </w:r>
+    </w:p>
+    <w:p>
+      <w:pPr>
+        <w:pStyle w:val="Zadanie"/>
+        <w:rPr/>
+      </w:pPr>
+      <w:r>
+        <w:rPr/>
+      </w:r>
+    </w:p>
+    <w:p>
+      <w:pPr>
+        <w:pStyle w:val="Zadanie"/>
+        <w:rPr/>
+      </w:pPr>
+      <w:r>
+        <w:rPr/>
+      </w:r>
+    </w:p>
+    <w:p>
+      <w:pPr>
+        <w:pStyle w:val="Zadanie"/>
+        <w:rPr/>
+      </w:pPr>
+      <w:r>
+        <w:rPr/>
+      </w:r>
+    </w:p>
+    <w:p>
+      <w:pPr>
+        <w:pStyle w:val="Zadanie"/>
+        <w:rPr/>
+      </w:pPr>
+      <w:r>
+        <w:rPr/>
+      </w:r>
+    </w:p>
+    <w:p>
+      <w:pPr>
+        <w:pStyle w:val="Zadanie"/>
+        <w:rPr/>
+      </w:pPr>
+      <w:r>
+        <w:rPr/>
+      </w:r>
+    </w:p>
+    <w:p>
+      <w:pPr>
+        <w:pStyle w:val="Zadanie"/>
+        <w:rPr/>
+      </w:pPr>
+      <w:r>
+        <w:rPr/>
+      </w:r>
+    </w:p>
+    <w:p>
+      <w:pPr>
+        <w:pStyle w:val="Zadanie"/>
+        <w:rPr/>
+      </w:pPr>
+      <w:r>
+        <w:rPr/>
       </w:r>
     </w:p>
     <w:p>
@@ -3545,8 +4202,8 @@
         <w:tblLook w:firstRow="1" w:noVBand="1" w:lastRow="0" w:firstColumn="1" w:lastColumn="0" w:noHBand="0" w:val="04a0"/>
       </w:tblPr>
       <w:tblGrid>
-        <w:gridCol w:w="8195"/>
-        <w:gridCol w:w="1135"/>
+        <w:gridCol w:w="8194"/>
+        <w:gridCol w:w="1136"/>
         <w:gridCol w:w="1136"/>
       </w:tblGrid>
       <w:tr>
@@ -3555,7 +4212,7 @@
         </w:trPr>
         <w:tc>
           <w:tcPr>
-            <w:tcW w:w="8195" w:type="dxa"/>
+            <w:tcW w:w="8194" w:type="dxa"/>
             <w:tcBorders/>
             <w:vAlign w:val="center"/>
           </w:tcPr>
@@ -3563,6 +4220,7 @@
             <w:pPr>
               <w:pStyle w:val="PunktyTabela"/>
               <w:widowControl/>
+              <w:suppressAutoHyphens w:val="true"/>
               <w:spacing w:before="0" w:after="0"/>
               <w:jc w:val="start"/>
               <w:rPr>
@@ -3582,38 +4240,6 @@
                 <w:lang w:eastAsia="en-US" w:bidi="ar-SA"/>
               </w:rPr>
               <w:t>Punkty:</w:t>
-            </w:r>
-          </w:p>
-        </w:tc>
-        <w:tc>
-          <w:tcPr>
-            <w:tcW w:w="1135" w:type="dxa"/>
-            <w:tcBorders/>
-            <w:vAlign w:val="center"/>
-          </w:tcPr>
-          <w:p>
-            <w:pPr>
-              <w:pStyle w:val="PunktyTabela"/>
-              <w:widowControl/>
-              <w:spacing w:before="0" w:after="0"/>
-              <w:jc w:val="center"/>
-              <w:rPr>
-                <w:rFonts w:ascii="Calibri" w:hAnsi="Calibri" w:eastAsia="Calibri" w:cs="Arial"/>
-                <w:kern w:val="2"/>
-                <w:sz w:val="22"/>
-                <w:szCs w:val="22"/>
-                <w:lang w:eastAsia="en-US" w:bidi="ar-SA"/>
-              </w:rPr>
-            </w:pPr>
-            <w:r>
-              <w:rPr>
-                <w:rFonts w:eastAsia="Calibri" w:cs="Arial"/>
-                <w:kern w:val="2"/>
-                <w:sz w:val="22"/>
-                <w:szCs w:val="22"/>
-                <w:lang w:eastAsia="en-US" w:bidi="ar-SA"/>
-              </w:rPr>
-              <w:t>0</w:t>
             </w:r>
           </w:p>
         </w:tc>
@@ -3627,6 +4253,7 @@
             <w:pPr>
               <w:pStyle w:val="PunktyTabela"/>
               <w:widowControl/>
+              <w:suppressAutoHyphens w:val="true"/>
               <w:spacing w:before="0" w:after="0"/>
               <w:jc w:val="center"/>
               <w:rPr>
@@ -3645,6 +4272,39 @@
                 <w:szCs w:val="22"/>
                 <w:lang w:eastAsia="en-US" w:bidi="ar-SA"/>
               </w:rPr>
+              <w:t>0</w:t>
+            </w:r>
+          </w:p>
+        </w:tc>
+        <w:tc>
+          <w:tcPr>
+            <w:tcW w:w="1136" w:type="dxa"/>
+            <w:tcBorders/>
+            <w:vAlign w:val="center"/>
+          </w:tcPr>
+          <w:p>
+            <w:pPr>
+              <w:pStyle w:val="PunktyTabela"/>
+              <w:widowControl/>
+              <w:suppressAutoHyphens w:val="true"/>
+              <w:spacing w:before="0" w:after="0"/>
+              <w:jc w:val="center"/>
+              <w:rPr>
+                <w:rFonts w:ascii="Calibri" w:hAnsi="Calibri" w:eastAsia="Calibri" w:cs="Arial"/>
+                <w:kern w:val="2"/>
+                <w:sz w:val="22"/>
+                <w:szCs w:val="22"/>
+                <w:lang w:eastAsia="en-US" w:bidi="ar-SA"/>
+              </w:rPr>
+            </w:pPr>
+            <w:r>
+              <w:rPr>
+                <w:rFonts w:eastAsia="Calibri" w:cs="Arial"/>
+                <w:kern w:val="2"/>
+                <w:sz w:val="22"/>
+                <w:szCs w:val="22"/>
+                <w:lang w:eastAsia="en-US" w:bidi="ar-SA"/>
+              </w:rPr>
               <w:t>1</w:t>
             </w:r>
           </w:p>
@@ -3667,6 +4327,22 @@
           <w:lang w:val="pl-PL"/>
         </w:rPr>
       </w:pPr>
+      <w:r>
+        <w:rPr>
+          <w:lang w:val="pl-PL"/>
+        </w:rPr>
+      </w:r>
+      <w:r>
+        <w:br w:type="page"/>
+      </w:r>
+    </w:p>
+    <w:p>
+      <w:pPr>
+        <w:pStyle w:val="Heading1"/>
+        <w:rPr>
+          <w:lang w:val="pl-PL"/>
+        </w:rPr>
+      </w:pPr>
       <w:bookmarkStart w:id="13" w:name="_Toc209822159"/>
       <w:r>
         <w:rPr>
@@ -3707,20 +4383,19 @@
       </w:pPr>
       <w:r>
         <w:rPr/>
-      </w:r>
-    </w:p>
-    <w:p>
-      <w:pPr>
-        <w:pStyle w:val="Zadanie"/>
-        <w:rPr/>
-      </w:pPr>
-      <w:r>
-        <w:rPr/>
         <w:drawing>
-          <wp:inline distT="0" distB="0" distL="0" distR="0">
-            <wp:extent cx="3803650" cy="981075"/>
+          <wp:anchor behindDoc="0" distT="0" distB="0" distL="0" distR="0" simplePos="0" locked="0" layoutInCell="0" allowOverlap="1" relativeHeight="17">
+            <wp:simplePos x="0" y="0"/>
+            <wp:positionH relativeFrom="column">
+              <wp:posOffset>321945</wp:posOffset>
+            </wp:positionH>
+            <wp:positionV relativeFrom="paragraph">
+              <wp:posOffset>155575</wp:posOffset>
+            </wp:positionV>
+            <wp:extent cx="2324100" cy="952500"/>
             <wp:effectExtent l="0" t="0" r="0" b="0"/>
-            <wp:docPr id="15" name="Obraz 539446585"/>
+            <wp:wrapSquare wrapText="largest"/>
+            <wp:docPr id="15" name="Obraz13"/>
             <wp:cNvGraphicFramePr>
               <a:graphicFrameLocks xmlns:a="http://schemas.openxmlformats.org/drawingml/2006/main" noChangeAspect="1"/>
             </wp:cNvGraphicFramePr>
@@ -3728,7 +4403,7 @@
               <a:graphicData uri="http://schemas.openxmlformats.org/drawingml/2006/picture">
                 <pic:pic xmlns:pic="http://schemas.openxmlformats.org/drawingml/2006/picture">
                   <pic:nvPicPr>
-                    <pic:cNvPr id="15" name="Obraz 539446585"/>
+                    <pic:cNvPr id="15" name="Obraz13"/>
                     <pic:cNvPicPr>
                       <a:picLocks noChangeAspect="1" noChangeArrowheads="1"/>
                     </pic:cNvPicPr>
@@ -3742,7 +4417,7 @@
                   <pic:spPr bwMode="auto">
                     <a:xfrm>
                       <a:off x="0" y="0"/>
-                      <a:ext cx="3803650" cy="981075"/>
+                      <a:ext cx="2324100" cy="952500"/>
                     </a:xfrm>
                     <a:prstGeom prst="rect">
                       <a:avLst/>
@@ -3752,20 +4427,30 @@
                 </pic:pic>
               </a:graphicData>
             </a:graphic>
-          </wp:inline>
+          </wp:anchor>
         </w:drawing>
       </w:r>
-      <w:r>
-        <w:rPr/>
-        <w:t xml:space="preserve"> </w:t>
-      </w:r>
+    </w:p>
+    <w:p>
+      <w:pPr>
+        <w:pStyle w:val="Zadanie"/>
+        <w:rPr/>
+      </w:pPr>
       <w:r>
         <w:rPr/>
         <w:drawing>
-          <wp:inline distT="0" distB="0" distL="0" distR="0">
-            <wp:extent cx="2705100" cy="981075"/>
+          <wp:anchor behindDoc="0" distT="0" distB="0" distL="0" distR="0" simplePos="0" locked="0" layoutInCell="0" allowOverlap="1" relativeHeight="14">
+            <wp:simplePos x="0" y="0"/>
+            <wp:positionH relativeFrom="column">
+              <wp:posOffset>3102610</wp:posOffset>
+            </wp:positionH>
+            <wp:positionV relativeFrom="paragraph">
+              <wp:posOffset>44450</wp:posOffset>
+            </wp:positionV>
+            <wp:extent cx="3324225" cy="2425065"/>
             <wp:effectExtent l="0" t="0" r="0" b="0"/>
-            <wp:docPr id="16" name="Obraz 762983165"/>
+            <wp:wrapSquare wrapText="largest"/>
+            <wp:docPr id="16" name="Obraz10"/>
             <wp:cNvGraphicFramePr>
               <a:graphicFrameLocks xmlns:a="http://schemas.openxmlformats.org/drawingml/2006/main" noChangeAspect="1"/>
             </wp:cNvGraphicFramePr>
@@ -3773,7 +4458,7 @@
               <a:graphicData uri="http://schemas.openxmlformats.org/drawingml/2006/picture">
                 <pic:pic xmlns:pic="http://schemas.openxmlformats.org/drawingml/2006/picture">
                   <pic:nvPicPr>
-                    <pic:cNvPr id="16" name="Obraz 762983165"/>
+                    <pic:cNvPr id="16" name="Obraz10"/>
                     <pic:cNvPicPr>
                       <a:picLocks noChangeAspect="1" noChangeArrowheads="1"/>
                     </pic:cNvPicPr>
@@ -3787,7 +4472,7 @@
                   <pic:spPr bwMode="auto">
                     <a:xfrm>
                       <a:off x="0" y="0"/>
-                      <a:ext cx="2705100" cy="981075"/>
+                      <a:ext cx="3324225" cy="2425065"/>
                     </a:xfrm>
                     <a:prstGeom prst="rect">
                       <a:avLst/>
@@ -3797,27 +4482,39 @@
                 </pic:pic>
               </a:graphicData>
             </a:graphic>
-          </wp:inline>
+          </wp:anchor>
         </w:drawing>
       </w:r>
-    </w:p>
-    <w:p>
-      <w:pPr>
-        <w:pStyle w:val="Zadanie"/>
-        <w:rPr/>
-      </w:pPr>
-      <w:r>
-        <w:rPr/>
-      </w:r>
-    </w:p>
-    <w:p>
-      <w:pPr>
-        <w:pStyle w:val="Zadanie"/>
-        <w:rPr/>
-      </w:pPr>
-      <w:r>
-        <w:rPr/>
-        <w:t>Wstaw zrzuty ekranu przedstawiające wygląd listy i zawartość local storage po dodaniu nowej pozycji listy. Upewnij się, że widoczne w local storage są dane dotyczące nowego zadania:</w:t>
+      <w:r>
+        <w:rPr/>
+        <w:t xml:space="preserve"> </w:t>
+      </w:r>
+    </w:p>
+    <w:p>
+      <w:pPr>
+        <w:pStyle w:val="Zadanie"/>
+        <w:rPr/>
+      </w:pPr>
+      <w:r>
+        <w:rPr/>
+      </w:r>
+    </w:p>
+    <w:p>
+      <w:pPr>
+        <w:pStyle w:val="Zadanie"/>
+        <w:rPr/>
+      </w:pPr>
+      <w:r>
+        <w:rPr/>
+      </w:r>
+    </w:p>
+    <w:p>
+      <w:pPr>
+        <w:pStyle w:val="Zadanie"/>
+        <w:rPr/>
+      </w:pPr>
+      <w:r>
+        <w:rPr/>
       </w:r>
     </w:p>
     <w:p>
@@ -3837,10 +4534,18 @@
       <w:r>
         <w:rPr/>
         <w:drawing>
-          <wp:inline distT="0" distB="0" distL="0" distR="0">
-            <wp:extent cx="3803650" cy="981075"/>
+          <wp:anchor behindDoc="0" distT="0" distB="0" distL="0" distR="0" simplePos="0" locked="0" layoutInCell="0" allowOverlap="1" relativeHeight="13">
+            <wp:simplePos x="0" y="0"/>
+            <wp:positionH relativeFrom="column">
+              <wp:posOffset>46355</wp:posOffset>
+            </wp:positionH>
+            <wp:positionV relativeFrom="paragraph">
+              <wp:posOffset>114300</wp:posOffset>
+            </wp:positionV>
+            <wp:extent cx="2971165" cy="1500505"/>
             <wp:effectExtent l="0" t="0" r="0" b="0"/>
-            <wp:docPr id="17" name="Obraz 1742050848"/>
+            <wp:wrapSquare wrapText="largest"/>
+            <wp:docPr id="17" name="Obraz9"/>
             <wp:cNvGraphicFramePr>
               <a:graphicFrameLocks xmlns:a="http://schemas.openxmlformats.org/drawingml/2006/main" noChangeAspect="1"/>
             </wp:cNvGraphicFramePr>
@@ -3848,7 +4553,7 @@
               <a:graphicData uri="http://schemas.openxmlformats.org/drawingml/2006/picture">
                 <pic:pic xmlns:pic="http://schemas.openxmlformats.org/drawingml/2006/picture">
                   <pic:nvPicPr>
-                    <pic:cNvPr id="17" name="Obraz 1742050848"/>
+                    <pic:cNvPr id="17" name="Obraz9"/>
                     <pic:cNvPicPr>
                       <a:picLocks noChangeAspect="1" noChangeArrowheads="1"/>
                     </pic:cNvPicPr>
@@ -3862,7 +4567,7 @@
                   <pic:spPr bwMode="auto">
                     <a:xfrm>
                       <a:off x="0" y="0"/>
-                      <a:ext cx="3803650" cy="981075"/>
+                      <a:ext cx="2971165" cy="1500505"/>
                     </a:xfrm>
                     <a:prstGeom prst="rect">
                       <a:avLst/>
@@ -3872,20 +4577,114 @@
                 </pic:pic>
               </a:graphicData>
             </a:graphic>
-          </wp:inline>
+          </wp:anchor>
         </w:drawing>
       </w:r>
-      <w:r>
-        <w:rPr/>
-        <w:t xml:space="preserve"> </w:t>
-      </w:r>
-      <w:r>
-        <w:rPr/>
+    </w:p>
+    <w:p>
+      <w:pPr>
+        <w:pStyle w:val="Zadanie"/>
+        <w:rPr/>
+      </w:pPr>
+      <w:r>
+        <w:rPr/>
+      </w:r>
+    </w:p>
+    <w:p>
+      <w:pPr>
+        <w:pStyle w:val="Zadanie"/>
+        <w:rPr/>
+      </w:pPr>
+      <w:r>
+        <w:rPr/>
+      </w:r>
+    </w:p>
+    <w:p>
+      <w:pPr>
+        <w:pStyle w:val="Zadanie"/>
+        <w:rPr/>
+      </w:pPr>
+      <w:r>
+        <w:rPr/>
+      </w:r>
+    </w:p>
+    <w:p>
+      <w:pPr>
+        <w:pStyle w:val="Zadanie"/>
+        <w:rPr/>
+      </w:pPr>
+      <w:r>
+        <w:rPr/>
+      </w:r>
+    </w:p>
+    <w:p>
+      <w:pPr>
+        <w:pStyle w:val="Zadanie"/>
+        <w:rPr/>
+      </w:pPr>
+      <w:r>
+        <w:rPr/>
+      </w:r>
+    </w:p>
+    <w:p>
+      <w:pPr>
+        <w:pStyle w:val="Zadanie"/>
+        <w:rPr/>
+      </w:pPr>
+      <w:r>
+        <w:rPr/>
+      </w:r>
+    </w:p>
+    <w:p>
+      <w:pPr>
+        <w:pStyle w:val="Zadanie"/>
+        <w:rPr/>
+      </w:pPr>
+      <w:r>
+        <w:rPr/>
+      </w:r>
+    </w:p>
+    <w:p>
+      <w:pPr>
+        <w:pStyle w:val="Zadanie"/>
+        <w:rPr/>
+      </w:pPr>
+      <w:r>
+        <w:rPr/>
+      </w:r>
+    </w:p>
+    <w:p>
+      <w:pPr>
+        <w:pStyle w:val="Zadanie"/>
+        <w:rPr/>
+      </w:pPr>
+      <w:r>
+        <w:rPr/>
+      </w:r>
+    </w:p>
+    <w:p>
+      <w:pPr>
+        <w:pStyle w:val="Zadanie"/>
+        <w:rPr/>
+      </w:pPr>
+      <w:r>
+        <w:rPr/>
+        <w:t>Wstaw zrzuty ekranu przedstawiające wygląd listy i zawartość local storage po dodaniu nowej pozycji listy. Upewnij się, że widoczne w local storage są dane dotyczące now</w:t>
+      </w:r>
+      <w:r>
         <w:drawing>
-          <wp:inline distT="0" distB="0" distL="0" distR="0">
-            <wp:extent cx="2705100" cy="981075"/>
+          <wp:anchor behindDoc="0" distT="0" distB="0" distL="0" distR="0" simplePos="0" locked="0" layoutInCell="0" allowOverlap="1" relativeHeight="16">
+            <wp:simplePos x="0" y="0"/>
+            <wp:positionH relativeFrom="column">
+              <wp:posOffset>3093085</wp:posOffset>
+            </wp:positionH>
+            <wp:positionV relativeFrom="paragraph">
+              <wp:posOffset>352425</wp:posOffset>
+            </wp:positionV>
+            <wp:extent cx="3337560" cy="3924935"/>
             <wp:effectExtent l="0" t="0" r="0" b="0"/>
-            <wp:docPr id="18" name="Obraz 335608957"/>
+            <wp:wrapSquare wrapText="largest"/>
+            <wp:docPr id="18" name="Obraz12"/>
             <wp:cNvGraphicFramePr>
               <a:graphicFrameLocks xmlns:a="http://schemas.openxmlformats.org/drawingml/2006/main" noChangeAspect="1"/>
             </wp:cNvGraphicFramePr>
@@ -3893,7 +4692,7 @@
               <a:graphicData uri="http://schemas.openxmlformats.org/drawingml/2006/picture">
                 <pic:pic xmlns:pic="http://schemas.openxmlformats.org/drawingml/2006/picture">
                   <pic:nvPicPr>
-                    <pic:cNvPr id="18" name="Obraz 335608957"/>
+                    <pic:cNvPr id="18" name="Obraz12"/>
                     <pic:cNvPicPr>
                       <a:picLocks noChangeAspect="1" noChangeArrowheads="1"/>
                     </pic:cNvPicPr>
@@ -3907,7 +4706,7 @@
                   <pic:spPr bwMode="auto">
                     <a:xfrm>
                       <a:off x="0" y="0"/>
-                      <a:ext cx="2705100" cy="981075"/>
+                      <a:ext cx="3337560" cy="3924935"/>
                     </a:xfrm>
                     <a:prstGeom prst="rect">
                       <a:avLst/>
@@ -3917,8 +4716,239 @@
                 </pic:pic>
               </a:graphicData>
             </a:graphic>
-          </wp:inline>
+          </wp:anchor>
         </w:drawing>
+      </w:r>
+      <w:r>
+        <w:rPr/>
+        <w:t>ego zadania:</w:t>
+      </w:r>
+    </w:p>
+    <w:p>
+      <w:pPr>
+        <w:pStyle w:val="Zadanie"/>
+        <w:rPr/>
+      </w:pPr>
+      <w:r>
+        <w:rPr/>
+      </w:r>
+    </w:p>
+    <w:p>
+      <w:pPr>
+        <w:pStyle w:val="Zadanie"/>
+        <w:rPr/>
+      </w:pPr>
+      <w:r>
+        <w:rPr/>
+        <w:t xml:space="preserve"> </w:t>
+      </w:r>
+    </w:p>
+    <w:p>
+      <w:pPr>
+        <w:pStyle w:val="Zadanie"/>
+        <w:rPr/>
+      </w:pPr>
+      <w:r>
+        <w:rPr/>
+      </w:r>
+    </w:p>
+    <w:p>
+      <w:pPr>
+        <w:pStyle w:val="Zadanie"/>
+        <w:rPr/>
+      </w:pPr>
+      <w:r>
+        <w:rPr/>
+        <w:drawing>
+          <wp:anchor behindDoc="0" distT="0" distB="0" distL="0" distR="0" simplePos="0" locked="0" layoutInCell="0" allowOverlap="1" relativeHeight="15">
+            <wp:simplePos x="0" y="0"/>
+            <wp:positionH relativeFrom="column">
+              <wp:posOffset>46355</wp:posOffset>
+            </wp:positionH>
+            <wp:positionV relativeFrom="paragraph">
+              <wp:posOffset>165100</wp:posOffset>
+            </wp:positionV>
+            <wp:extent cx="2999740" cy="1897380"/>
+            <wp:effectExtent l="0" t="0" r="0" b="0"/>
+            <wp:wrapSquare wrapText="largest"/>
+            <wp:docPr id="19" name="Obraz11"/>
+            <wp:cNvGraphicFramePr>
+              <a:graphicFrameLocks xmlns:a="http://schemas.openxmlformats.org/drawingml/2006/main" noChangeAspect="1"/>
+            </wp:cNvGraphicFramePr>
+            <a:graphic xmlns:a="http://schemas.openxmlformats.org/drawingml/2006/main">
+              <a:graphicData uri="http://schemas.openxmlformats.org/drawingml/2006/picture">
+                <pic:pic xmlns:pic="http://schemas.openxmlformats.org/drawingml/2006/picture">
+                  <pic:nvPicPr>
+                    <pic:cNvPr id="19" name="Obraz11"/>
+                    <pic:cNvPicPr>
+                      <a:picLocks noChangeAspect="1" noChangeArrowheads="1"/>
+                    </pic:cNvPicPr>
+                  </pic:nvPicPr>
+                  <pic:blipFill>
+                    <a:blip r:embed="rId20"/>
+                    <a:stretch>
+                      <a:fillRect/>
+                    </a:stretch>
+                  </pic:blipFill>
+                  <pic:spPr bwMode="auto">
+                    <a:xfrm>
+                      <a:off x="0" y="0"/>
+                      <a:ext cx="2999740" cy="1897380"/>
+                    </a:xfrm>
+                    <a:prstGeom prst="rect">
+                      <a:avLst/>
+                    </a:prstGeom>
+                    <a:noFill/>
+                  </pic:spPr>
+                </pic:pic>
+              </a:graphicData>
+            </a:graphic>
+          </wp:anchor>
+        </w:drawing>
+      </w:r>
+    </w:p>
+    <w:p>
+      <w:pPr>
+        <w:pStyle w:val="Zadanie"/>
+        <w:rPr/>
+      </w:pPr>
+      <w:r>
+        <w:rPr/>
+      </w:r>
+    </w:p>
+    <w:p>
+      <w:pPr>
+        <w:pStyle w:val="Zadanie"/>
+        <w:rPr/>
+      </w:pPr>
+      <w:r>
+        <w:rPr/>
+      </w:r>
+    </w:p>
+    <w:p>
+      <w:pPr>
+        <w:pStyle w:val="Zadanie"/>
+        <w:rPr/>
+      </w:pPr>
+      <w:r>
+        <w:rPr/>
+      </w:r>
+    </w:p>
+    <w:p>
+      <w:pPr>
+        <w:pStyle w:val="Zadanie"/>
+        <w:rPr/>
+      </w:pPr>
+      <w:r>
+        <w:rPr/>
+      </w:r>
+    </w:p>
+    <w:p>
+      <w:pPr>
+        <w:pStyle w:val="Zadanie"/>
+        <w:rPr/>
+      </w:pPr>
+      <w:r>
+        <w:rPr/>
+      </w:r>
+    </w:p>
+    <w:p>
+      <w:pPr>
+        <w:pStyle w:val="Zadanie"/>
+        <w:rPr/>
+      </w:pPr>
+      <w:r>
+        <w:rPr/>
+      </w:r>
+    </w:p>
+    <w:p>
+      <w:pPr>
+        <w:pStyle w:val="Zadanie"/>
+        <w:rPr/>
+      </w:pPr>
+      <w:r>
+        <w:rPr/>
+      </w:r>
+    </w:p>
+    <w:p>
+      <w:pPr>
+        <w:pStyle w:val="Zadanie"/>
+        <w:rPr/>
+      </w:pPr>
+      <w:r>
+        <w:rPr/>
+      </w:r>
+    </w:p>
+    <w:p>
+      <w:pPr>
+        <w:pStyle w:val="Zadanie"/>
+        <w:rPr/>
+      </w:pPr>
+      <w:r>
+        <w:rPr/>
+      </w:r>
+    </w:p>
+    <w:p>
+      <w:pPr>
+        <w:pStyle w:val="Zadanie"/>
+        <w:rPr/>
+      </w:pPr>
+      <w:r>
+        <w:rPr/>
+      </w:r>
+    </w:p>
+    <w:p>
+      <w:pPr>
+        <w:pStyle w:val="Zadanie"/>
+        <w:rPr/>
+      </w:pPr>
+      <w:r>
+        <w:rPr/>
+      </w:r>
+    </w:p>
+    <w:p>
+      <w:pPr>
+        <w:pStyle w:val="Zadanie"/>
+        <w:rPr/>
+      </w:pPr>
+      <w:r>
+        <w:rPr/>
+      </w:r>
+    </w:p>
+    <w:p>
+      <w:pPr>
+        <w:pStyle w:val="Zadanie"/>
+        <w:rPr/>
+      </w:pPr>
+      <w:r>
+        <w:rPr/>
+      </w:r>
+    </w:p>
+    <w:p>
+      <w:pPr>
+        <w:pStyle w:val="Zadanie"/>
+        <w:rPr/>
+      </w:pPr>
+      <w:r>
+        <w:rPr/>
+      </w:r>
+    </w:p>
+    <w:p>
+      <w:pPr>
+        <w:pStyle w:val="Zadanie"/>
+        <w:rPr/>
+      </w:pPr>
+      <w:r>
+        <w:rPr/>
+      </w:r>
+    </w:p>
+    <w:p>
+      <w:pPr>
+        <w:pStyle w:val="Zadanie"/>
+        <w:rPr/>
+      </w:pPr>
+      <w:r>
+        <w:rPr/>
       </w:r>
     </w:p>
     <w:p>
@@ -3946,8 +4976,8 @@
         <w:tblLook w:firstRow="1" w:noVBand="1" w:lastRow="0" w:firstColumn="1" w:lastColumn="0" w:noHBand="0" w:val="04a0"/>
       </w:tblPr>
       <w:tblGrid>
-        <w:gridCol w:w="8195"/>
-        <w:gridCol w:w="1135"/>
+        <w:gridCol w:w="8194"/>
+        <w:gridCol w:w="1136"/>
         <w:gridCol w:w="1136"/>
       </w:tblGrid>
       <w:tr>
@@ -3956,7 +4986,7 @@
         </w:trPr>
         <w:tc>
           <w:tcPr>
-            <w:tcW w:w="8195" w:type="dxa"/>
+            <w:tcW w:w="8194" w:type="dxa"/>
             <w:tcBorders/>
             <w:vAlign w:val="center"/>
           </w:tcPr>
@@ -3964,6 +4994,7 @@
             <w:pPr>
               <w:pStyle w:val="PunktyTabela"/>
               <w:widowControl/>
+              <w:suppressAutoHyphens w:val="true"/>
               <w:spacing w:before="0" w:after="0"/>
               <w:jc w:val="start"/>
               <w:rPr>
@@ -3983,38 +5014,6 @@
                 <w:lang w:eastAsia="en-US" w:bidi="ar-SA"/>
               </w:rPr>
               <w:t>Punkty:</w:t>
-            </w:r>
-          </w:p>
-        </w:tc>
-        <w:tc>
-          <w:tcPr>
-            <w:tcW w:w="1135" w:type="dxa"/>
-            <w:tcBorders/>
-            <w:vAlign w:val="center"/>
-          </w:tcPr>
-          <w:p>
-            <w:pPr>
-              <w:pStyle w:val="PunktyTabela"/>
-              <w:widowControl/>
-              <w:spacing w:before="0" w:after="0"/>
-              <w:jc w:val="center"/>
-              <w:rPr>
-                <w:rFonts w:ascii="Calibri" w:hAnsi="Calibri" w:eastAsia="Calibri" w:cs="Arial"/>
-                <w:kern w:val="2"/>
-                <w:sz w:val="22"/>
-                <w:szCs w:val="22"/>
-                <w:lang w:eastAsia="en-US" w:bidi="ar-SA"/>
-              </w:rPr>
-            </w:pPr>
-            <w:r>
-              <w:rPr>
-                <w:rFonts w:eastAsia="Calibri" w:cs="Arial"/>
-                <w:kern w:val="2"/>
-                <w:sz w:val="22"/>
-                <w:szCs w:val="22"/>
-                <w:lang w:eastAsia="en-US" w:bidi="ar-SA"/>
-              </w:rPr>
-              <w:t>0</w:t>
             </w:r>
           </w:p>
         </w:tc>
@@ -4028,6 +5027,7 @@
             <w:pPr>
               <w:pStyle w:val="PunktyTabela"/>
               <w:widowControl/>
+              <w:suppressAutoHyphens w:val="true"/>
               <w:spacing w:before="0" w:after="0"/>
               <w:jc w:val="center"/>
               <w:rPr>
@@ -4046,6 +5046,39 @@
                 <w:szCs w:val="22"/>
                 <w:lang w:eastAsia="en-US" w:bidi="ar-SA"/>
               </w:rPr>
+              <w:t>0</w:t>
+            </w:r>
+          </w:p>
+        </w:tc>
+        <w:tc>
+          <w:tcPr>
+            <w:tcW w:w="1136" w:type="dxa"/>
+            <w:tcBorders/>
+            <w:vAlign w:val="center"/>
+          </w:tcPr>
+          <w:p>
+            <w:pPr>
+              <w:pStyle w:val="PunktyTabela"/>
+              <w:widowControl/>
+              <w:suppressAutoHyphens w:val="true"/>
+              <w:spacing w:before="0" w:after="0"/>
+              <w:jc w:val="center"/>
+              <w:rPr>
+                <w:rFonts w:ascii="Calibri" w:hAnsi="Calibri" w:eastAsia="Calibri" w:cs="Arial"/>
+                <w:kern w:val="2"/>
+                <w:sz w:val="22"/>
+                <w:szCs w:val="22"/>
+                <w:lang w:eastAsia="en-US" w:bidi="ar-SA"/>
+              </w:rPr>
+            </w:pPr>
+            <w:r>
+              <w:rPr>
+                <w:rFonts w:eastAsia="Calibri" w:cs="Arial"/>
+                <w:kern w:val="2"/>
+                <w:sz w:val="22"/>
+                <w:szCs w:val="22"/>
+                <w:lang w:eastAsia="en-US" w:bidi="ar-SA"/>
+              </w:rPr>
               <w:t>1</w:t>
             </w:r>
           </w:p>
@@ -4054,6 +5087,22 @@
     </w:tbl>
     <w:p>
       <w:pPr>
+        <w:pStyle w:val="Heading1"/>
+        <w:rPr>
+          <w:lang w:val="pl-PL"/>
+        </w:rPr>
+      </w:pPr>
+      <w:bookmarkStart w:id="14" w:name="_Toc209822160"/>
+      <w:r>
+        <w:rPr>
+          <w:lang w:val="pl-PL"/>
+        </w:rPr>
+        <w:t>Wyszukiwanie</w:t>
+      </w:r>
+      <w:bookmarkEnd w:id="14"/>
+    </w:p>
+    <w:p>
+      <w:pPr>
         <w:pStyle w:val="Normal"/>
         <w:rPr>
           <w:lang w:val="pl-PL"/>
@@ -4063,35 +5112,6 @@
         <w:rPr>
           <w:lang w:val="pl-PL"/>
         </w:rPr>
-      </w:r>
-    </w:p>
-    <w:p>
-      <w:pPr>
-        <w:pStyle w:val="Heading1"/>
-        <w:rPr>
-          <w:lang w:val="pl-PL"/>
-        </w:rPr>
-      </w:pPr>
-      <w:bookmarkStart w:id="14" w:name="_Toc209822160"/>
-      <w:r>
-        <w:rPr>
-          <w:lang w:val="pl-PL"/>
-        </w:rPr>
-        <w:t>Wyszukiwanie</w:t>
-      </w:r>
-      <w:bookmarkEnd w:id="14"/>
-    </w:p>
-    <w:p>
-      <w:pPr>
-        <w:pStyle w:val="Normal"/>
-        <w:rPr>
-          <w:lang w:val="pl-PL"/>
-        </w:rPr>
-      </w:pPr>
-      <w:r>
-        <w:rPr>
-          <w:lang w:val="pl-PL"/>
-        </w:rPr>
         <w:t xml:space="preserve">Na koniec zostało filtrowanie wyników. Proponowanym podejściem do tego tematu jest umieszczenie w klasie Todo właściwości </w:t>
       </w:r>
       <w:r>
@@ -4172,20 +5192,19 @@
       </w:pPr>
       <w:r>
         <w:rPr/>
-      </w:r>
-    </w:p>
-    <w:p>
-      <w:pPr>
-        <w:pStyle w:val="Zadanie"/>
-        <w:rPr/>
-      </w:pPr>
-      <w:r>
-        <w:rPr/>
         <w:drawing>
-          <wp:inline distT="0" distB="0" distL="0" distR="0">
-            <wp:extent cx="6645910" cy="981075"/>
+          <wp:anchor behindDoc="0" distT="0" distB="0" distL="0" distR="0" simplePos="0" locked="0" layoutInCell="0" allowOverlap="1" relativeHeight="19">
+            <wp:simplePos x="0" y="0"/>
+            <wp:positionH relativeFrom="column">
+              <wp:posOffset>1462405</wp:posOffset>
+            </wp:positionH>
+            <wp:positionV relativeFrom="paragraph">
+              <wp:posOffset>139700</wp:posOffset>
+            </wp:positionV>
+            <wp:extent cx="2730500" cy="2771775"/>
             <wp:effectExtent l="0" t="0" r="0" b="0"/>
-            <wp:docPr id="19" name="Obraz 164692492"/>
+            <wp:wrapSquare wrapText="largest"/>
+            <wp:docPr id="20" name="Obraz14"/>
             <wp:cNvGraphicFramePr>
               <a:graphicFrameLocks xmlns:a="http://schemas.openxmlformats.org/drawingml/2006/main" noChangeAspect="1"/>
             </wp:cNvGraphicFramePr>
@@ -4193,82 +5212,7 @@
               <a:graphicData uri="http://schemas.openxmlformats.org/drawingml/2006/picture">
                 <pic:pic xmlns:pic="http://schemas.openxmlformats.org/drawingml/2006/picture">
                   <pic:nvPicPr>
-                    <pic:cNvPr id="19" name="Obraz 164692492"/>
-                    <pic:cNvPicPr>
-                      <a:picLocks noChangeAspect="1" noChangeArrowheads="1"/>
-                    </pic:cNvPicPr>
-                  </pic:nvPicPr>
-                  <pic:blipFill>
-                    <a:blip r:embed="rId20"/>
-                    <a:stretch>
-                      <a:fillRect/>
-                    </a:stretch>
-                  </pic:blipFill>
-                  <pic:spPr bwMode="auto">
-                    <a:xfrm>
-                      <a:off x="0" y="0"/>
-                      <a:ext cx="6645910" cy="981075"/>
-                    </a:xfrm>
-                    <a:prstGeom prst="rect">
-                      <a:avLst/>
-                    </a:prstGeom>
-                    <a:noFill/>
-                  </pic:spPr>
-                </pic:pic>
-              </a:graphicData>
-            </a:graphic>
-          </wp:inline>
-        </w:drawing>
-      </w:r>
-    </w:p>
-    <w:p>
-      <w:pPr>
-        <w:pStyle w:val="Zadanie"/>
-        <w:rPr/>
-      </w:pPr>
-      <w:r>
-        <w:rPr/>
-      </w:r>
-    </w:p>
-    <w:p>
-      <w:pPr>
-        <w:pStyle w:val="Zadanie"/>
-        <w:rPr/>
-      </w:pPr>
-      <w:r>
-        <w:rPr/>
-        <w:t>Wstaw zrzut ekranu listy, gdy w polu wyszukiwania wpisano wystarczająco dużo znaków, by zadziałało filtrowanie. Upewnij się, że chociaż 2 wyniki będą wciąż widoczne:</w:t>
-      </w:r>
-    </w:p>
-    <w:p>
-      <w:pPr>
-        <w:pStyle w:val="Zadanie"/>
-        <w:rPr/>
-      </w:pPr>
-      <w:r>
-        <w:rPr/>
-      </w:r>
-    </w:p>
-    <w:p>
-      <w:pPr>
-        <w:pStyle w:val="Zadanie"/>
-        <w:rPr/>
-      </w:pPr>
-      <w:r>
-        <w:rPr/>
-        <w:drawing>
-          <wp:inline distT="0" distB="0" distL="0" distR="0">
-            <wp:extent cx="6645910" cy="981075"/>
-            <wp:effectExtent l="0" t="0" r="0" b="0"/>
-            <wp:docPr id="20" name="Obraz 230476778"/>
-            <wp:cNvGraphicFramePr>
-              <a:graphicFrameLocks xmlns:a="http://schemas.openxmlformats.org/drawingml/2006/main" noChangeAspect="1"/>
-            </wp:cNvGraphicFramePr>
-            <a:graphic xmlns:a="http://schemas.openxmlformats.org/drawingml/2006/main">
-              <a:graphicData uri="http://schemas.openxmlformats.org/drawingml/2006/picture">
-                <pic:pic xmlns:pic="http://schemas.openxmlformats.org/drawingml/2006/picture">
-                  <pic:nvPicPr>
-                    <pic:cNvPr id="20" name="Obraz 230476778"/>
+                    <pic:cNvPr id="20" name="Obraz14"/>
                     <pic:cNvPicPr>
                       <a:picLocks noChangeAspect="1" noChangeArrowheads="1"/>
                     </pic:cNvPicPr>
@@ -4282,7 +5226,7 @@
                   <pic:spPr bwMode="auto">
                     <a:xfrm>
                       <a:off x="0" y="0"/>
-                      <a:ext cx="6645910" cy="981075"/>
+                      <a:ext cx="2730500" cy="2771775"/>
                     </a:xfrm>
                     <a:prstGeom prst="rect">
                       <a:avLst/>
@@ -4292,8 +5236,307 @@
                 </pic:pic>
               </a:graphicData>
             </a:graphic>
-          </wp:inline>
+          </wp:anchor>
         </w:drawing>
+      </w:r>
+    </w:p>
+    <w:p>
+      <w:pPr>
+        <w:pStyle w:val="Zadanie"/>
+        <w:rPr/>
+      </w:pPr>
+      <w:r>
+        <w:rPr/>
+      </w:r>
+    </w:p>
+    <w:p>
+      <w:pPr>
+        <w:pStyle w:val="Zadanie"/>
+        <w:rPr/>
+      </w:pPr>
+      <w:r>
+        <w:rPr/>
+      </w:r>
+    </w:p>
+    <w:p>
+      <w:pPr>
+        <w:pStyle w:val="Zadanie"/>
+        <w:rPr/>
+      </w:pPr>
+      <w:r>
+        <w:rPr/>
+      </w:r>
+    </w:p>
+    <w:p>
+      <w:pPr>
+        <w:pStyle w:val="Zadanie"/>
+        <w:rPr/>
+      </w:pPr>
+      <w:r>
+        <w:rPr/>
+      </w:r>
+    </w:p>
+    <w:p>
+      <w:pPr>
+        <w:pStyle w:val="Zadanie"/>
+        <w:rPr/>
+      </w:pPr>
+      <w:r>
+        <w:rPr/>
+      </w:r>
+    </w:p>
+    <w:p>
+      <w:pPr>
+        <w:pStyle w:val="Zadanie"/>
+        <w:rPr/>
+      </w:pPr>
+      <w:r>
+        <w:rPr/>
+      </w:r>
+    </w:p>
+    <w:p>
+      <w:pPr>
+        <w:pStyle w:val="Zadanie"/>
+        <w:rPr/>
+      </w:pPr>
+      <w:r>
+        <w:rPr/>
+      </w:r>
+    </w:p>
+    <w:p>
+      <w:pPr>
+        <w:pStyle w:val="Zadanie"/>
+        <w:rPr/>
+      </w:pPr>
+      <w:r>
+        <w:rPr/>
+      </w:r>
+    </w:p>
+    <w:p>
+      <w:pPr>
+        <w:pStyle w:val="Zadanie"/>
+        <w:rPr/>
+      </w:pPr>
+      <w:r>
+        <w:rPr/>
+      </w:r>
+    </w:p>
+    <w:p>
+      <w:pPr>
+        <w:pStyle w:val="Zadanie"/>
+        <w:rPr/>
+      </w:pPr>
+      <w:r>
+        <w:rPr/>
+      </w:r>
+    </w:p>
+    <w:p>
+      <w:pPr>
+        <w:pStyle w:val="Zadanie"/>
+        <w:rPr/>
+      </w:pPr>
+      <w:r>
+        <w:rPr/>
+      </w:r>
+    </w:p>
+    <w:p>
+      <w:pPr>
+        <w:pStyle w:val="Zadanie"/>
+        <w:rPr/>
+      </w:pPr>
+      <w:r>
+        <w:rPr/>
+      </w:r>
+    </w:p>
+    <w:p>
+      <w:pPr>
+        <w:pStyle w:val="Zadanie"/>
+        <w:rPr/>
+      </w:pPr>
+      <w:r>
+        <w:rPr/>
+      </w:r>
+    </w:p>
+    <w:p>
+      <w:pPr>
+        <w:pStyle w:val="Zadanie"/>
+        <w:rPr/>
+      </w:pPr>
+      <w:r>
+        <w:rPr/>
+      </w:r>
+    </w:p>
+    <w:p>
+      <w:pPr>
+        <w:pStyle w:val="Zadanie"/>
+        <w:rPr/>
+      </w:pPr>
+      <w:r>
+        <w:rPr/>
+      </w:r>
+    </w:p>
+    <w:p>
+      <w:pPr>
+        <w:pStyle w:val="Zadanie"/>
+        <w:rPr/>
+      </w:pPr>
+      <w:r>
+        <w:rPr/>
+        <w:t>Wstaw zrzut ekranu listy, gdy w polu wyszukiwania wpisano wystarczająco dużo znaków, by zadziałało filtrowanie. Upewnij się, że chociaż 2 wyniki będą wciąż widoczne:</w:t>
+      </w:r>
+    </w:p>
+    <w:p>
+      <w:pPr>
+        <w:pStyle w:val="Zadanie"/>
+        <w:rPr/>
+      </w:pPr>
+      <w:r>
+        <w:rPr/>
+        <w:drawing>
+          <wp:anchor behindDoc="0" distT="0" distB="0" distL="0" distR="0" simplePos="0" locked="0" layoutInCell="0" allowOverlap="1" relativeHeight="20">
+            <wp:simplePos x="0" y="0"/>
+            <wp:positionH relativeFrom="column">
+              <wp:posOffset>1503680</wp:posOffset>
+            </wp:positionH>
+            <wp:positionV relativeFrom="paragraph">
+              <wp:posOffset>142875</wp:posOffset>
+            </wp:positionV>
+            <wp:extent cx="2907665" cy="1839595"/>
+            <wp:effectExtent l="0" t="0" r="0" b="0"/>
+            <wp:wrapSquare wrapText="largest"/>
+            <wp:docPr id="21" name="Obraz15"/>
+            <wp:cNvGraphicFramePr>
+              <a:graphicFrameLocks xmlns:a="http://schemas.openxmlformats.org/drawingml/2006/main" noChangeAspect="1"/>
+            </wp:cNvGraphicFramePr>
+            <a:graphic xmlns:a="http://schemas.openxmlformats.org/drawingml/2006/main">
+              <a:graphicData uri="http://schemas.openxmlformats.org/drawingml/2006/picture">
+                <pic:pic xmlns:pic="http://schemas.openxmlformats.org/drawingml/2006/picture">
+                  <pic:nvPicPr>
+                    <pic:cNvPr id="21" name="Obraz15"/>
+                    <pic:cNvPicPr>
+                      <a:picLocks noChangeAspect="1" noChangeArrowheads="1"/>
+                    </pic:cNvPicPr>
+                  </pic:nvPicPr>
+                  <pic:blipFill>
+                    <a:blip r:embed="rId22"/>
+                    <a:stretch>
+                      <a:fillRect/>
+                    </a:stretch>
+                  </pic:blipFill>
+                  <pic:spPr bwMode="auto">
+                    <a:xfrm>
+                      <a:off x="0" y="0"/>
+                      <a:ext cx="2907665" cy="1839595"/>
+                    </a:xfrm>
+                    <a:prstGeom prst="rect">
+                      <a:avLst/>
+                    </a:prstGeom>
+                    <a:noFill/>
+                  </pic:spPr>
+                </pic:pic>
+              </a:graphicData>
+            </a:graphic>
+          </wp:anchor>
+        </w:drawing>
+      </w:r>
+    </w:p>
+    <w:p>
+      <w:pPr>
+        <w:pStyle w:val="Zadanie"/>
+        <w:rPr/>
+      </w:pPr>
+      <w:r>
+        <w:rPr/>
+      </w:r>
+    </w:p>
+    <w:p>
+      <w:pPr>
+        <w:pStyle w:val="Zadanie"/>
+        <w:rPr/>
+      </w:pPr>
+      <w:r>
+        <w:rPr/>
+      </w:r>
+    </w:p>
+    <w:p>
+      <w:pPr>
+        <w:pStyle w:val="Zadanie"/>
+        <w:rPr/>
+      </w:pPr>
+      <w:r>
+        <w:rPr/>
+      </w:r>
+    </w:p>
+    <w:p>
+      <w:pPr>
+        <w:pStyle w:val="Zadanie"/>
+        <w:rPr/>
+      </w:pPr>
+      <w:r>
+        <w:rPr/>
+      </w:r>
+    </w:p>
+    <w:p>
+      <w:pPr>
+        <w:pStyle w:val="Zadanie"/>
+        <w:rPr/>
+      </w:pPr>
+      <w:r>
+        <w:rPr/>
+      </w:r>
+    </w:p>
+    <w:p>
+      <w:pPr>
+        <w:pStyle w:val="Zadanie"/>
+        <w:rPr/>
+      </w:pPr>
+      <w:r>
+        <w:rPr/>
+      </w:r>
+    </w:p>
+    <w:p>
+      <w:pPr>
+        <w:pStyle w:val="Zadanie"/>
+        <w:rPr/>
+      </w:pPr>
+      <w:r>
+        <w:rPr/>
+      </w:r>
+    </w:p>
+    <w:p>
+      <w:pPr>
+        <w:pStyle w:val="Zadanie"/>
+        <w:rPr/>
+      </w:pPr>
+      <w:r>
+        <w:rPr/>
+      </w:r>
+    </w:p>
+    <w:p>
+      <w:pPr>
+        <w:pStyle w:val="Zadanie"/>
+        <w:rPr/>
+      </w:pPr>
+      <w:r>
+        <w:rPr/>
+      </w:r>
+    </w:p>
+    <w:p>
+      <w:pPr>
+        <w:pStyle w:val="Zadanie"/>
+        <w:rPr/>
+      </w:pPr>
+      <w:r>
+        <w:rPr/>
+      </w:r>
+    </w:p>
+    <w:p>
+      <w:pPr>
+        <w:pStyle w:val="Zadanie"/>
+        <w:rPr/>
+      </w:pPr>
+      <w:r>
+        <w:rPr/>
       </w:r>
     </w:p>
     <w:tbl>
@@ -4312,8 +5555,8 @@
         <w:tblLook w:firstRow="1" w:noVBand="1" w:lastRow="0" w:firstColumn="1" w:lastColumn="0" w:noHBand="0" w:val="04a0"/>
       </w:tblPr>
       <w:tblGrid>
-        <w:gridCol w:w="8195"/>
-        <w:gridCol w:w="1135"/>
+        <w:gridCol w:w="8194"/>
+        <w:gridCol w:w="1136"/>
         <w:gridCol w:w="1136"/>
       </w:tblGrid>
       <w:tr>
@@ -4322,7 +5565,7 @@
         </w:trPr>
         <w:tc>
           <w:tcPr>
-            <w:tcW w:w="8195" w:type="dxa"/>
+            <w:tcW w:w="8194" w:type="dxa"/>
             <w:tcBorders/>
             <w:vAlign w:val="center"/>
           </w:tcPr>
@@ -4330,6 +5573,7 @@
             <w:pPr>
               <w:pStyle w:val="PunktyTabela"/>
               <w:widowControl/>
+              <w:suppressAutoHyphens w:val="true"/>
               <w:spacing w:before="0" w:after="0"/>
               <w:jc w:val="start"/>
               <w:rPr>
@@ -4349,38 +5593,6 @@
                 <w:lang w:eastAsia="en-US" w:bidi="ar-SA"/>
               </w:rPr>
               <w:t>Punkty:</w:t>
-            </w:r>
-          </w:p>
-        </w:tc>
-        <w:tc>
-          <w:tcPr>
-            <w:tcW w:w="1135" w:type="dxa"/>
-            <w:tcBorders/>
-            <w:vAlign w:val="center"/>
-          </w:tcPr>
-          <w:p>
-            <w:pPr>
-              <w:pStyle w:val="PunktyTabela"/>
-              <w:widowControl/>
-              <w:spacing w:before="0" w:after="0"/>
-              <w:jc w:val="center"/>
-              <w:rPr>
-                <w:rFonts w:ascii="Calibri" w:hAnsi="Calibri" w:eastAsia="Calibri" w:cs="Arial"/>
-                <w:kern w:val="2"/>
-                <w:sz w:val="22"/>
-                <w:szCs w:val="22"/>
-                <w:lang w:eastAsia="en-US" w:bidi="ar-SA"/>
-              </w:rPr>
-            </w:pPr>
-            <w:r>
-              <w:rPr>
-                <w:rFonts w:eastAsia="Calibri" w:cs="Arial"/>
-                <w:kern w:val="2"/>
-                <w:sz w:val="22"/>
-                <w:szCs w:val="22"/>
-                <w:lang w:eastAsia="en-US" w:bidi="ar-SA"/>
-              </w:rPr>
-              <w:t>0</w:t>
             </w:r>
           </w:p>
         </w:tc>
@@ -4394,6 +5606,7 @@
             <w:pPr>
               <w:pStyle w:val="PunktyTabela"/>
               <w:widowControl/>
+              <w:suppressAutoHyphens w:val="true"/>
               <w:spacing w:before="0" w:after="0"/>
               <w:jc w:val="center"/>
               <w:rPr>
@@ -4412,6 +5625,39 @@
                 <w:szCs w:val="22"/>
                 <w:lang w:eastAsia="en-US" w:bidi="ar-SA"/>
               </w:rPr>
+              <w:t>0</w:t>
+            </w:r>
+          </w:p>
+        </w:tc>
+        <w:tc>
+          <w:tcPr>
+            <w:tcW w:w="1136" w:type="dxa"/>
+            <w:tcBorders/>
+            <w:vAlign w:val="center"/>
+          </w:tcPr>
+          <w:p>
+            <w:pPr>
+              <w:pStyle w:val="PunktyTabela"/>
+              <w:widowControl/>
+              <w:suppressAutoHyphens w:val="true"/>
+              <w:spacing w:before="0" w:after="0"/>
+              <w:jc w:val="center"/>
+              <w:rPr>
+                <w:rFonts w:ascii="Calibri" w:hAnsi="Calibri" w:eastAsia="Calibri" w:cs="Arial"/>
+                <w:kern w:val="2"/>
+                <w:sz w:val="22"/>
+                <w:szCs w:val="22"/>
+                <w:lang w:eastAsia="en-US" w:bidi="ar-SA"/>
+              </w:rPr>
+            </w:pPr>
+            <w:r>
+              <w:rPr>
+                <w:rFonts w:eastAsia="Calibri" w:cs="Arial"/>
+                <w:kern w:val="2"/>
+                <w:sz w:val="22"/>
+                <w:szCs w:val="22"/>
+                <w:lang w:eastAsia="en-US" w:bidi="ar-SA"/>
+              </w:rPr>
               <w:t>1</w:t>
             </w:r>
           </w:p>
@@ -4430,6 +5676,22 @@
           <w:lang w:val="pl-PL"/>
         </w:rPr>
       </w:r>
+      <w:r>
+        <w:br w:type="page"/>
+      </w:r>
+    </w:p>
+    <w:p>
+      <w:pPr>
+        <w:pStyle w:val="Normal"/>
+        <w:rPr>
+          <w:lang w:val="pl-PL"/>
+        </w:rPr>
+      </w:pPr>
+      <w:r>
+        <w:rPr>
+          <w:lang w:val="pl-PL"/>
+        </w:rPr>
+      </w:r>
     </w:p>
     <w:p>
       <w:pPr>
@@ -4491,20 +5753,19 @@
       </w:pPr>
       <w:r>
         <w:rPr/>
-      </w:r>
-    </w:p>
-    <w:p>
-      <w:pPr>
-        <w:pStyle w:val="Zadanie"/>
-        <w:rPr/>
-      </w:pPr>
-      <w:r>
-        <w:rPr/>
         <w:drawing>
-          <wp:inline distT="0" distB="0" distL="0" distR="0">
-            <wp:extent cx="6645910" cy="981075"/>
+          <wp:anchor behindDoc="0" distT="0" distB="0" distL="0" distR="0" simplePos="0" locked="0" layoutInCell="0" allowOverlap="1" relativeHeight="18">
+            <wp:simplePos x="0" y="0"/>
+            <wp:positionH relativeFrom="column">
+              <wp:posOffset>1341755</wp:posOffset>
+            </wp:positionH>
+            <wp:positionV relativeFrom="paragraph">
+              <wp:posOffset>79375</wp:posOffset>
+            </wp:positionV>
+            <wp:extent cx="3810000" cy="1924050"/>
             <wp:effectExtent l="0" t="0" r="0" b="0"/>
-            <wp:docPr id="21" name="Obraz 827805346"/>
+            <wp:wrapSquare wrapText="largest"/>
+            <wp:docPr id="22" name="Obraz16"/>
             <wp:cNvGraphicFramePr>
               <a:graphicFrameLocks xmlns:a="http://schemas.openxmlformats.org/drawingml/2006/main" noChangeAspect="1"/>
             </wp:cNvGraphicFramePr>
@@ -4512,13 +5773,13 @@
               <a:graphicData uri="http://schemas.openxmlformats.org/drawingml/2006/picture">
                 <pic:pic xmlns:pic="http://schemas.openxmlformats.org/drawingml/2006/picture">
                   <pic:nvPicPr>
-                    <pic:cNvPr id="21" name="Obraz 827805346"/>
+                    <pic:cNvPr id="22" name="Obraz16"/>
                     <pic:cNvPicPr>
                       <a:picLocks noChangeAspect="1" noChangeArrowheads="1"/>
                     </pic:cNvPicPr>
                   </pic:nvPicPr>
                   <pic:blipFill>
-                    <a:blip r:embed="rId22"/>
+                    <a:blip r:embed="rId23"/>
                     <a:stretch>
                       <a:fillRect/>
                     </a:stretch>
@@ -4526,7 +5787,7 @@
                   <pic:spPr bwMode="auto">
                     <a:xfrm>
                       <a:off x="0" y="0"/>
-                      <a:ext cx="6645910" cy="981075"/>
+                      <a:ext cx="3810000" cy="1924050"/>
                     </a:xfrm>
                     <a:prstGeom prst="rect">
                       <a:avLst/>
@@ -4536,8 +5797,98 @@
                 </pic:pic>
               </a:graphicData>
             </a:graphic>
-          </wp:inline>
+          </wp:anchor>
         </w:drawing>
+      </w:r>
+    </w:p>
+    <w:p>
+      <w:pPr>
+        <w:pStyle w:val="Zadanie"/>
+        <w:rPr/>
+      </w:pPr>
+      <w:r>
+        <w:rPr/>
+      </w:r>
+    </w:p>
+    <w:p>
+      <w:pPr>
+        <w:pStyle w:val="Zadanie"/>
+        <w:rPr/>
+      </w:pPr>
+      <w:r>
+        <w:rPr/>
+      </w:r>
+    </w:p>
+    <w:p>
+      <w:pPr>
+        <w:pStyle w:val="Zadanie"/>
+        <w:rPr/>
+      </w:pPr>
+      <w:r>
+        <w:rPr/>
+      </w:r>
+    </w:p>
+    <w:p>
+      <w:pPr>
+        <w:pStyle w:val="Zadanie"/>
+        <w:rPr/>
+      </w:pPr>
+      <w:r>
+        <w:rPr/>
+      </w:r>
+    </w:p>
+    <w:p>
+      <w:pPr>
+        <w:pStyle w:val="Zadanie"/>
+        <w:rPr/>
+      </w:pPr>
+      <w:r>
+        <w:rPr/>
+      </w:r>
+    </w:p>
+    <w:p>
+      <w:pPr>
+        <w:pStyle w:val="Zadanie"/>
+        <w:rPr/>
+      </w:pPr>
+      <w:r>
+        <w:rPr/>
+      </w:r>
+    </w:p>
+    <w:p>
+      <w:pPr>
+        <w:pStyle w:val="Zadanie"/>
+        <w:rPr/>
+      </w:pPr>
+      <w:r>
+        <w:rPr/>
+      </w:r>
+    </w:p>
+    <w:p>
+      <w:pPr>
+        <w:pStyle w:val="Zadanie"/>
+        <w:rPr/>
+      </w:pPr>
+      <w:r>
+        <w:rPr/>
+      </w:r>
+    </w:p>
+    <w:p>
+      <w:pPr>
+        <w:pStyle w:val="Zadanie"/>
+        <w:rPr/>
+      </w:pPr>
+      <w:r>
+        <w:rPr/>
+      </w:r>
+    </w:p>
+    <w:p>
+      <w:pPr>
+        <w:pStyle w:val="Zadanie"/>
+        <w:rPr/>
+      </w:pPr>
+      <w:r>
+        <w:rPr/>
       </w:r>
     </w:p>
     <w:tbl>
@@ -4556,8 +5907,8 @@
         <w:tblLook w:firstRow="1" w:noVBand="1" w:lastRow="0" w:firstColumn="1" w:lastColumn="0" w:noHBand="0" w:val="04a0"/>
       </w:tblPr>
       <w:tblGrid>
-        <w:gridCol w:w="8195"/>
-        <w:gridCol w:w="1135"/>
+        <w:gridCol w:w="8194"/>
+        <w:gridCol w:w="1136"/>
         <w:gridCol w:w="1136"/>
       </w:tblGrid>
       <w:tr>
@@ -4566,7 +5917,7 @@
         </w:trPr>
         <w:tc>
           <w:tcPr>
-            <w:tcW w:w="8195" w:type="dxa"/>
+            <w:tcW w:w="8194" w:type="dxa"/>
             <w:tcBorders/>
             <w:vAlign w:val="center"/>
           </w:tcPr>
@@ -4574,6 +5925,7 @@
             <w:pPr>
               <w:pStyle w:val="PunktyTabela"/>
               <w:widowControl/>
+              <w:suppressAutoHyphens w:val="true"/>
               <w:spacing w:before="0" w:after="0"/>
               <w:jc w:val="start"/>
               <w:rPr>
@@ -4593,38 +5945,6 @@
                 <w:lang w:eastAsia="en-US" w:bidi="ar-SA"/>
               </w:rPr>
               <w:t>Punkty:</w:t>
-            </w:r>
-          </w:p>
-        </w:tc>
-        <w:tc>
-          <w:tcPr>
-            <w:tcW w:w="1135" w:type="dxa"/>
-            <w:tcBorders/>
-            <w:vAlign w:val="center"/>
-          </w:tcPr>
-          <w:p>
-            <w:pPr>
-              <w:pStyle w:val="PunktyTabela"/>
-              <w:widowControl/>
-              <w:spacing w:before="0" w:after="0"/>
-              <w:jc w:val="center"/>
-              <w:rPr>
-                <w:rFonts w:ascii="Calibri" w:hAnsi="Calibri" w:eastAsia="Calibri" w:cs="Arial"/>
-                <w:kern w:val="2"/>
-                <w:sz w:val="22"/>
-                <w:szCs w:val="22"/>
-                <w:lang w:eastAsia="en-US" w:bidi="ar-SA"/>
-              </w:rPr>
-            </w:pPr>
-            <w:r>
-              <w:rPr>
-                <w:rFonts w:eastAsia="Calibri" w:cs="Arial"/>
-                <w:kern w:val="2"/>
-                <w:sz w:val="22"/>
-                <w:szCs w:val="22"/>
-                <w:lang w:eastAsia="en-US" w:bidi="ar-SA"/>
-              </w:rPr>
-              <w:t>0</w:t>
             </w:r>
           </w:p>
         </w:tc>
@@ -4638,6 +5958,7 @@
             <w:pPr>
               <w:pStyle w:val="PunktyTabela"/>
               <w:widowControl/>
+              <w:suppressAutoHyphens w:val="true"/>
               <w:spacing w:before="0" w:after="0"/>
               <w:jc w:val="center"/>
               <w:rPr>
@@ -4656,6 +5977,39 @@
                 <w:szCs w:val="22"/>
                 <w:lang w:eastAsia="en-US" w:bidi="ar-SA"/>
               </w:rPr>
+              <w:t>0</w:t>
+            </w:r>
+          </w:p>
+        </w:tc>
+        <w:tc>
+          <w:tcPr>
+            <w:tcW w:w="1136" w:type="dxa"/>
+            <w:tcBorders/>
+            <w:vAlign w:val="center"/>
+          </w:tcPr>
+          <w:p>
+            <w:pPr>
+              <w:pStyle w:val="PunktyTabela"/>
+              <w:widowControl/>
+              <w:suppressAutoHyphens w:val="true"/>
+              <w:spacing w:before="0" w:after="0"/>
+              <w:jc w:val="center"/>
+              <w:rPr>
+                <w:rFonts w:ascii="Calibri" w:hAnsi="Calibri" w:eastAsia="Calibri" w:cs="Arial"/>
+                <w:kern w:val="2"/>
+                <w:sz w:val="22"/>
+                <w:szCs w:val="22"/>
+                <w:lang w:eastAsia="en-US" w:bidi="ar-SA"/>
+              </w:rPr>
+            </w:pPr>
+            <w:r>
+              <w:rPr>
+                <w:rFonts w:eastAsia="Calibri" w:cs="Arial"/>
+                <w:kern w:val="2"/>
+                <w:sz w:val="22"/>
+                <w:szCs w:val="22"/>
+                <w:lang w:eastAsia="en-US" w:bidi="ar-SA"/>
+              </w:rPr>
               <w:t>1</w:t>
             </w:r>
           </w:p>
@@ -4667,8 +6021,8 @@
         <w:pStyle w:val="Heading1"/>
         <w:rPr/>
       </w:pPr>
-      <w:bookmarkStart w:id="15" w:name="_Toc209822161"/>
-      <w:bookmarkStart w:id="16" w:name="_Toc146283472"/>
+      <w:bookmarkStart w:id="15" w:name="_Toc146283472"/>
+      <w:bookmarkStart w:id="16" w:name="_Toc209822161"/>
       <w:r>
         <w:rPr/>
         <w:t>Commit projektu do GIT</w:t>
@@ -4758,14 +6112,58 @@
         <w:rPr/>
         <w:t xml:space="preserve">link, np. </w:t>
       </w:r>
-      <w:hyperlink r:id="rId23">
+      <w:hyperlink r:id="rId24">
         <w:r>
           <w:rPr>
             <w:rStyle w:val="Hyperlink"/>
           </w:rPr>
-          <w:t>https://github.com/inazwisko/ai1-lab/tree/lab-b…</w:t>
+          <w:t>https://github.com/inazwisko/ai1-lab/tree/lab-b</w:t>
         </w:r>
       </w:hyperlink>
+      <w:hyperlink r:id="rId25">
+        <w:r>
+          <w:rPr>
+            <w:rStyle w:val="Hyperlink"/>
+          </w:rPr>
+          <w:t>…</w:t>
+        </w:r>
+      </w:hyperlink>
+    </w:p>
+    <w:p>
+      <w:pPr>
+        <w:pStyle w:val="Zadanie"/>
+        <w:rPr>
+          <w:rStyle w:val="Hyperlink"/>
+        </w:rPr>
+      </w:pPr>
+      <w:r>
+        <w:rPr/>
+      </w:r>
+    </w:p>
+    <w:p>
+      <w:pPr>
+        <w:pStyle w:val="Zadanie"/>
+        <w:rPr/>
+      </w:pPr>
+      <w:hyperlink r:id="rId26">
+        <w:r>
+          <w:rPr>
+            <w:rStyle w:val="Hyperlink"/>
+          </w:rPr>
+          <w:t>https://github.com/jaqbqlik/5-semestr-Aplikacje-Internetowe-/tree/main/lab-b</w:t>
+        </w:r>
+      </w:hyperlink>
+    </w:p>
+    <w:p>
+      <w:pPr>
+        <w:pStyle w:val="Zadanie"/>
+        <w:rPr>
+          <w:rStyle w:val="Hyperlink"/>
+        </w:rPr>
+      </w:pPr>
+      <w:r>
+        <w:rPr/>
+      </w:r>
     </w:p>
     <w:p>
       <w:pPr>
@@ -4774,6 +6172,22 @@
           <w:lang w:val="pl-PL"/>
         </w:rPr>
       </w:pPr>
+      <w:r>
+        <w:rPr>
+          <w:lang w:val="pl-PL"/>
+        </w:rPr>
+      </w:r>
+      <w:r>
+        <w:br w:type="page"/>
+      </w:r>
+    </w:p>
+    <w:p>
+      <w:pPr>
+        <w:pStyle w:val="Heading1"/>
+        <w:rPr>
+          <w:lang w:val="pl-PL"/>
+        </w:rPr>
+      </w:pPr>
       <w:bookmarkStart w:id="17" w:name="_Toc209822162"/>
       <w:r>
         <w:rPr>
@@ -4809,11 +6223,125 @@
       </w:pPr>
       <w:r>
         <w:rPr/>
-        <w:t>…</w:t>
-      </w:r>
-      <w:r>
-        <w:rPr/>
-        <w:t>podsumowanie…</w:t>
+        <w:t xml:space="preserve">Ogólnie ciekawe dość </w:t>
+      </w:r>
+      <w:r>
+        <w:rPr/>
+        <w:t>laboratoria…</w:t>
+      </w:r>
+    </w:p>
+    <w:p>
+      <w:pPr>
+        <w:pStyle w:val="Zadanie"/>
+        <w:rPr/>
+      </w:pPr>
+      <w:r>
+        <w:rPr/>
+      </w:r>
+    </w:p>
+    <w:p>
+      <w:pPr>
+        <w:pStyle w:val="Zadanie"/>
+        <w:rPr/>
+      </w:pPr>
+      <w:r>
+        <w:rPr/>
+        <w:t xml:space="preserve">Ale zadanie </w:t>
+      </w:r>
+    </w:p>
+    <w:p>
+      <w:pPr>
+        <w:pStyle w:val="Zadanie"/>
+        <w:rPr/>
+      </w:pPr>
+      <w:r>
+        <w:rPr/>
+        <w:t>„</w:t>
+      </w:r>
+      <w:r>
+        <w:rPr/>
+        <w:t>Wstaw zrzut ekranu listy, gdy w polu wyszukiwania wpisano wystarczająco dużo znaków, by zadziałało filtrowanie. Upewnij się, że chociaż 2 wyniki będą wciąż widoczne:</w:t>
+      </w:r>
+      <w:r>
+        <w:rPr/>
+        <w:t xml:space="preserve"> „</w:t>
+      </w:r>
+    </w:p>
+    <w:p>
+      <w:pPr>
+        <w:pStyle w:val="Zadanie"/>
+        <w:rPr/>
+      </w:pPr>
+      <w:r>
+        <w:rPr/>
+        <w:t xml:space="preserve">oraz </w:t>
+      </w:r>
+    </w:p>
+    <w:p>
+      <w:pPr>
+        <w:pStyle w:val="Zadanie"/>
+        <w:rPr/>
+      </w:pPr>
+      <w:r>
+        <w:rPr/>
+        <w:t>„</w:t>
+      </w:r>
+      <w:r>
+        <w:rPr/>
+        <w:t xml:space="preserve">Wstaw zrzut ekranu przedstawiający podświetlenie szukanej frazy w wynikach wyszukiwania, przykładowo dla frazy </w:t>
+      </w:r>
+      <w:r>
+        <w:rPr>
+          <w:rStyle w:val="inline-code"/>
+        </w:rPr>
+        <w:t>ko</w:t>
+      </w:r>
+      <w:r>
+        <w:rPr/>
+        <w:t xml:space="preserve"> i zadania </w:t>
+      </w:r>
+      <w:r>
+        <w:rPr>
+          <w:rStyle w:val="inline-code"/>
+        </w:rPr>
+        <w:t>Ala ma kota</w:t>
+      </w:r>
+      <w:r>
+        <w:rPr/>
+        <w:t xml:space="preserve"> otrzymujemy: </w:t>
+      </w:r>
+      <w:r>
+        <w:rPr>
+          <w:rStyle w:val="inline-code"/>
+        </w:rPr>
+        <w:t xml:space="preserve">Ala ma </w:t>
+      </w:r>
+      <w:r>
+        <w:rPr>
+          <w:rStyle w:val="inline-code"/>
+          <w:highlight w:val="yellow"/>
+        </w:rPr>
+        <w:t>ko</w:t>
+      </w:r>
+      <w:r>
+        <w:rPr>
+          <w:rStyle w:val="inline-code"/>
+        </w:rPr>
+        <w:t>ta</w:t>
+      </w:r>
+      <w:r>
+        <w:rPr/>
+        <w:t xml:space="preserve">:” </w:t>
+      </w:r>
+    </w:p>
+    <w:p>
+      <w:pPr>
+        <w:pStyle w:val="Zadanie"/>
+        <w:rPr/>
+      </w:pPr>
+      <w:r>
+        <w:rPr/>
+        <w:t>Wydają się dosyć podobne do siebie, no chyba ze coś źle zrozumiałem.</w:t>
       </w:r>
     </w:p>
     <w:p>
@@ -4845,12 +6373,12 @@
       </w:r>
     </w:p>
     <w:sectPr>
-      <w:headerReference w:type="even" r:id="rId24"/>
-      <w:headerReference w:type="default" r:id="rId25"/>
-      <w:headerReference w:type="first" r:id="rId26"/>
-      <w:footerReference w:type="even" r:id="rId27"/>
-      <w:footerReference w:type="default" r:id="rId28"/>
-      <w:footerReference w:type="first" r:id="rId29"/>
+      <w:headerReference w:type="even" r:id="rId27"/>
+      <w:headerReference w:type="default" r:id="rId28"/>
+      <w:headerReference w:type="first" r:id="rId29"/>
+      <w:footerReference w:type="even" r:id="rId30"/>
+      <w:footerReference w:type="default" r:id="rId31"/>
+      <w:footerReference w:type="first" r:id="rId32"/>
       <w:type w:val="nextPage"/>
       <w:pgSz w:w="11906" w:h="16838"/>
       <w:pgMar w:left="720" w:right="720" w:gutter="0" w:header="708" w:top="765" w:footer="708" w:bottom="765"/>
@@ -4988,7 +6516,7 @@
             <w:szCs w:val="24"/>
             <w:bCs/>
           </w:rPr>
-          <w:t>7</w:t>
+          <w:t>9</w:t>
         </w:r>
         <w:r>
           <w:rPr>
@@ -5124,7 +6652,7 @@
             <w:szCs w:val="24"/>
             <w:bCs/>
           </w:rPr>
-          <w:t>7</w:t>
+          <w:t>9</w:t>
         </w:r>
         <w:r>
           <w:rPr>
@@ -5783,7 +7311,7 @@
   <w:docDefaults>
     <w:rPrDefault>
       <w:rPr>
-        <w:rFonts w:ascii="Calibri" w:hAnsi="Calibri" w:eastAsia="Calibri" w:cs="Arial" w:asciiTheme="minorHAnsi" w:cstheme="minorBidi" w:eastAsiaTheme="minorHAnsi" w:hAnsiTheme="minorHAnsi"/>
+        <w:rFonts w:ascii="Calibri" w:hAnsi="Calibri" w:eastAsia="Calibri" w:cs="" w:asciiTheme="minorHAnsi" w:cstheme="minorBidi" w:eastAsiaTheme="minorHAnsi" w:hAnsiTheme="minorHAnsi"/>
         <w:kern w:val="2"/>
         <w:sz w:val="22"/>
         <w:szCs w:val="22"/>
@@ -6181,12 +7709,13 @@
     <w:rsid w:val="00c16636"/>
     <w:pPr>
       <w:widowControl/>
+      <w:suppressAutoHyphens w:val="true"/>
       <w:bidi w:val="0"/>
       <w:spacing w:lineRule="auto" w:line="259" w:before="0" w:after="160"/>
       <w:jc w:val="start"/>
     </w:pPr>
     <w:rPr>
-      <w:rFonts w:ascii="Calibri" w:hAnsi="Calibri" w:eastAsia="Calibri" w:cs="Arial" w:asciiTheme="minorHAnsi" w:cstheme="minorBidi" w:eastAsiaTheme="minorHAnsi" w:hAnsiTheme="minorHAnsi"/>
+      <w:rFonts w:ascii="Calibri" w:hAnsi="Calibri" w:eastAsia="Calibri" w:cs="" w:asciiTheme="minorHAnsi" w:cstheme="minorBidi" w:eastAsiaTheme="minorHAnsi" w:hAnsiTheme="minorHAnsi"/>
       <w:color w:val="auto"/>
       <w:kern w:val="2"/>
       <w:sz w:val="22"/>
@@ -6210,7 +7739,7 @@
       <w:outlineLvl w:val="0"/>
     </w:pPr>
     <w:rPr>
-      <w:rFonts w:ascii="Calibri Light" w:hAnsi="Calibri Light" w:eastAsia="" w:cs="Times New Roman" w:asciiTheme="majorHAnsi" w:cstheme="majorBidi" w:eastAsiaTheme="majorEastAsia" w:hAnsiTheme="majorHAnsi"/>
+      <w:rFonts w:ascii="Calibri Light" w:hAnsi="Calibri Light" w:eastAsia="" w:cs="" w:asciiTheme="majorHAnsi" w:cstheme="majorBidi" w:eastAsiaTheme="majorEastAsia" w:hAnsiTheme="majorHAnsi"/>
       <w:b/>
       <w:smallCaps/>
       <w:sz w:val="32"/>
@@ -6248,7 +7777,7 @@
     <w:qFormat/>
     <w:rsid w:val="003b2421"/>
     <w:rPr>
-      <w:rFonts w:ascii="Calibri Light" w:hAnsi="Calibri Light" w:eastAsia="" w:cs="Times New Roman" w:asciiTheme="majorHAnsi" w:cstheme="majorBidi" w:eastAsiaTheme="majorEastAsia" w:hAnsiTheme="majorHAnsi"/>
+      <w:rFonts w:ascii="Calibri Light" w:hAnsi="Calibri Light" w:eastAsia="" w:cs="" w:asciiTheme="majorHAnsi" w:cstheme="majorBidi" w:eastAsiaTheme="majorEastAsia" w:hAnsiTheme="majorHAnsi"/>
       <w:b/>
       <w:smallCaps/>
       <w:sz w:val="32"/>
@@ -6273,7 +7802,7 @@
     <w:qFormat/>
     <w:rsid w:val="003b2421"/>
     <w:rPr>
-      <w:rFonts w:ascii="Calibri Light" w:hAnsi="Calibri Light" w:eastAsia="" w:cs="Times New Roman" w:asciiTheme="majorHAnsi" w:cstheme="majorBidi" w:eastAsiaTheme="majorEastAsia" w:hAnsiTheme="majorHAnsi"/>
+      <w:rFonts w:ascii="Calibri Light" w:hAnsi="Calibri Light" w:eastAsia="" w:cs="" w:asciiTheme="majorHAnsi" w:cstheme="majorBidi" w:eastAsiaTheme="majorEastAsia" w:hAnsiTheme="majorHAnsi"/>
       <w:b/>
       <w:smallCaps/>
       <w:spacing w:val="-10"/>
@@ -6318,6 +7847,11 @@
       <w:shd w:fill="F2F2F2" w:val="clear"/>
       <w:lang w:val="pl-PL"/>
     </w:rPr>
+  </w:style>
+  <w:style w:type="character" w:styleId="czeindeksuuser">
+    <w:name w:val="Łącze indeksu (user)"/>
+    <w:qFormat/>
+    <w:rPr/>
   </w:style>
   <w:style w:type="character" w:styleId="czeindeksu">
     <w:name w:val="Łącze indeksu"/>
@@ -6381,6 +7915,39 @@
     <w:rPr>
       <w:rFonts w:cs="Arial"/>
     </w:rPr>
+  </w:style>
+  <w:style w:type="paragraph" w:styleId="Nagwekuser">
+    <w:name w:val="Nagłówek (user)"/>
+    <w:basedOn w:val="Normal"/>
+    <w:next w:val="BodyText"/>
+    <w:qFormat/>
+    <w:pPr>
+      <w:keepNext w:val="true"/>
+      <w:spacing w:before="240" w:after="120"/>
+    </w:pPr>
+    <w:rPr>
+      <w:rFonts w:ascii="Liberation Sans" w:hAnsi="Liberation Sans" w:eastAsia="Microsoft YaHei" w:cs="Arial"/>
+      <w:sz w:val="28"/>
+      <w:szCs w:val="28"/>
+    </w:rPr>
+  </w:style>
+  <w:style w:type="paragraph" w:styleId="Indeksuser">
+    <w:name w:val="Indeks (user)"/>
+    <w:basedOn w:val="Normal"/>
+    <w:qFormat/>
+    <w:pPr>
+      <w:suppressLineNumbers/>
+    </w:pPr>
+    <w:rPr>
+      <w:rFonts w:cs="Arial"/>
+    </w:rPr>
+  </w:style>
+  <w:style w:type="paragraph" w:styleId="Gwkaistopkauser">
+    <w:name w:val="Główka i stopka (user)"/>
+    <w:basedOn w:val="Normal"/>
+    <w:qFormat/>
+    <w:pPr/>
+    <w:rPr/>
   </w:style>
   <w:style w:type="paragraph" w:styleId="Gwkaistopka">
     <w:name w:val="Główka i stopka"/>
@@ -6454,7 +8021,7 @@
       <w:jc w:val="center"/>
     </w:pPr>
     <w:rPr>
-      <w:rFonts w:ascii="Calibri Light" w:hAnsi="Calibri Light" w:eastAsia="" w:cs="Times New Roman" w:asciiTheme="majorHAnsi" w:cstheme="majorBidi" w:eastAsiaTheme="majorEastAsia" w:hAnsiTheme="majorHAnsi"/>
+      <w:rFonts w:ascii="Calibri Light" w:hAnsi="Calibri Light" w:eastAsia="" w:cs="" w:asciiTheme="majorHAnsi" w:cstheme="majorBidi" w:eastAsiaTheme="majorEastAsia" w:hAnsiTheme="majorHAnsi"/>
       <w:b/>
       <w:smallCaps/>
       <w:spacing w:val="-10"/>
@@ -6528,8 +8095,8 @@
       <w:lang w:val="pl-PL"/>
     </w:rPr>
   </w:style>
-  <w:style w:type="numbering" w:styleId="Bezlisty" w:default="1">
-    <w:name w:val="Bez listy"/>
+  <w:style w:type="numbering" w:styleId="Bezlistyuser" w:default="1">
+    <w:name w:val="Bez listy (user)"/>
     <w:uiPriority w:val="99"/>
     <w:semiHidden/>
     <w:unhideWhenUsed/>

</xml_diff>